<commit_message>
Cuarta entrega y capturas
Se actualiza cuarta entrega e integra capturas del backlog ágil
</commit_message>
<xml_diff>
--- a/Entregas y archivos/Trabajo Práctico Integrador - Cuarta Entrega - Joel Roth.docx
+++ b/Entregas y archivos/Trabajo Práctico Integrador - Cuarta Entrega - Joel Roth.docx
@@ -174,8 +174,9 @@
           <w:sz w:val="24"/>
           <w:szCs w:val="24"/>
         </w:rPr>
-        <w:t xml:space="preserve">Alumnos - Grupo n° </w:t>
-      </w:r>
+        <w:t xml:space="preserve">Alumnos - Grupo </w:t>
+      </w:r>
+      <w:proofErr w:type="spellStart"/>
       <w:r>
         <w:rPr>
           <w:rFonts w:ascii="Calibri" w:eastAsia="Calibri" w:hAnsi="Calibri" w:cs="Calibri"/>
@@ -183,6 +184,25 @@
           <w:sz w:val="24"/>
           <w:szCs w:val="24"/>
         </w:rPr>
+        <w:t>n°</w:t>
+      </w:r>
+      <w:proofErr w:type="spellEnd"/>
+      <w:r>
+        <w:rPr>
+          <w:rFonts w:ascii="Calibri" w:eastAsia="Calibri" w:hAnsi="Calibri" w:cs="Calibri"/>
+          <w:b/>
+          <w:sz w:val="24"/>
+          <w:szCs w:val="24"/>
+        </w:rPr>
+        <w:t xml:space="preserve"> </w:t>
+      </w:r>
+      <w:r>
+        <w:rPr>
+          <w:rFonts w:ascii="Calibri" w:eastAsia="Calibri" w:hAnsi="Calibri" w:cs="Calibri"/>
+          <w:b/>
+          <w:sz w:val="24"/>
+          <w:szCs w:val="24"/>
+        </w:rPr>
         <w:t>1</w:t>
       </w:r>
     </w:p>
@@ -389,8 +409,165 @@
     </w:p>
     <w:p>
       <w:pPr>
+        <w:tabs>
+          <w:tab w:val="center" w:pos="4606"/>
+          <w:tab w:val="left" w:pos="6394"/>
+        </w:tabs>
         <w:ind w:firstLine="0"/>
-        <w:jc w:val="center"/>
+        <w:rPr>
+          <w:rFonts w:ascii="Calibri" w:eastAsia="Calibri" w:hAnsi="Calibri" w:cs="Calibri"/>
+          <w:sz w:val="24"/>
+          <w:szCs w:val="24"/>
+        </w:rPr>
+      </w:pPr>
+      <w:r>
+        <w:rPr>
+          <w:rFonts w:ascii="Calibri" w:eastAsia="Calibri" w:hAnsi="Calibri" w:cs="Calibri"/>
+          <w:sz w:val="24"/>
+          <w:szCs w:val="24"/>
+        </w:rPr>
+        <w:tab/>
+      </w:r>
+      <w:r>
+        <w:rPr>
+          <w:rFonts w:ascii="Calibri" w:eastAsia="Calibri" w:hAnsi="Calibri" w:cs="Calibri"/>
+          <w:sz w:val="24"/>
+          <w:szCs w:val="24"/>
+        </w:rPr>
+        <w:t>1</w:t>
+      </w:r>
+      <w:r>
+        <w:rPr>
+          <w:rFonts w:ascii="Calibri" w:eastAsia="Calibri" w:hAnsi="Calibri" w:cs="Calibri"/>
+          <w:sz w:val="24"/>
+          <w:szCs w:val="24"/>
+        </w:rPr>
+        <w:t>9</w:t>
+      </w:r>
+      <w:r>
+        <w:rPr>
+          <w:rFonts w:ascii="Calibri" w:eastAsia="Calibri" w:hAnsi="Calibri" w:cs="Calibri"/>
+          <w:sz w:val="24"/>
+          <w:szCs w:val="24"/>
+        </w:rPr>
+        <w:t xml:space="preserve"> de </w:t>
+      </w:r>
+      <w:r>
+        <w:rPr>
+          <w:rFonts w:ascii="Calibri" w:eastAsia="Calibri" w:hAnsi="Calibri" w:cs="Calibri"/>
+          <w:sz w:val="24"/>
+          <w:szCs w:val="24"/>
+        </w:rPr>
+        <w:t>octubre</w:t>
+      </w:r>
+      <w:r>
+        <w:rPr>
+          <w:rFonts w:ascii="Calibri" w:eastAsia="Calibri" w:hAnsi="Calibri" w:cs="Calibri"/>
+          <w:sz w:val="24"/>
+          <w:szCs w:val="24"/>
+        </w:rPr>
+        <w:t xml:space="preserve"> de 2026</w:t>
+      </w:r>
+      <w:r>
+        <w:rPr>
+          <w:rFonts w:ascii="Calibri" w:eastAsia="Calibri" w:hAnsi="Calibri" w:cs="Calibri"/>
+          <w:sz w:val="24"/>
+          <w:szCs w:val="24"/>
+        </w:rPr>
+        <w:tab/>
+      </w:r>
+    </w:p>
+    <w:p>
+      <w:pPr>
+        <w:tabs>
+          <w:tab w:val="center" w:pos="4606"/>
+          <w:tab w:val="left" w:pos="6394"/>
+        </w:tabs>
+        <w:ind w:firstLine="0"/>
+        <w:rPr>
+          <w:rFonts w:ascii="Calibri" w:eastAsia="Calibri" w:hAnsi="Calibri" w:cs="Calibri"/>
+          <w:sz w:val="24"/>
+          <w:szCs w:val="24"/>
+        </w:rPr>
+      </w:pPr>
+    </w:p>
+    <w:p>
+      <w:pPr>
+        <w:tabs>
+          <w:tab w:val="center" w:pos="4606"/>
+          <w:tab w:val="left" w:pos="6394"/>
+        </w:tabs>
+        <w:ind w:firstLine="0"/>
+        <w:rPr>
+          <w:rFonts w:ascii="Arial" w:hAnsi="Arial" w:cs="Arial"/>
+          <w:lang w:val="es-ES"/>
+        </w:rPr>
+      </w:pPr>
+      <w:r>
+        <w:rPr>
+          <w:rFonts w:ascii="Arial" w:hAnsi="Arial" w:cs="Arial"/>
+          <w:lang w:val="es-ES"/>
+        </w:rPr>
+        <w:t>Repositorio Público en GitHub:</w:t>
+      </w:r>
+      <w:r>
+        <w:rPr>
+          <w:rFonts w:ascii="Arial" w:hAnsi="Arial" w:cs="Arial"/>
+          <w:lang w:val="es-ES"/>
+        </w:rPr>
+        <w:t xml:space="preserve"> </w:t>
+      </w:r>
+      <w:hyperlink r:id="rId8" w:history="1">
+        <w:r>
+          <w:rPr>
+            <w:rStyle w:val="Hipervnculo"/>
+            <w:rFonts w:ascii="Arial" w:hAnsi="Arial" w:cs="Arial"/>
+            <w:lang w:val="es-ES"/>
+          </w:rPr>
+          <w:t>https://github.com/joelroth9802/hardware-reco-docs</w:t>
+        </w:r>
+      </w:hyperlink>
+    </w:p>
+    <w:p>
+      <w:pPr>
+        <w:tabs>
+          <w:tab w:val="center" w:pos="4606"/>
+          <w:tab w:val="left" w:pos="6394"/>
+        </w:tabs>
+        <w:ind w:firstLine="0"/>
+        <w:rPr>
+          <w:rFonts w:ascii="Arial" w:eastAsia="Calibri" w:hAnsi="Arial" w:cs="Arial"/>
+        </w:rPr>
+      </w:pPr>
+      <w:r>
+        <w:rPr>
+          <w:rFonts w:ascii="Arial" w:eastAsia="Calibri" w:hAnsi="Arial" w:cs="Arial"/>
+        </w:rPr>
+        <w:t>Tablero Ágil de Gestión de Proyecto</w:t>
+      </w:r>
+      <w:r>
+        <w:rPr>
+          <w:rFonts w:ascii="Arial" w:eastAsia="Calibri" w:hAnsi="Arial" w:cs="Arial"/>
+        </w:rPr>
+        <w:t xml:space="preserve">: </w:t>
+      </w:r>
+      <w:hyperlink r:id="rId9" w:history="1">
+        <w:r>
+          <w:rPr>
+            <w:rStyle w:val="Hipervnculo"/>
+            <w:rFonts w:ascii="Arial" w:eastAsia="Calibri" w:hAnsi="Arial" w:cs="Arial"/>
+          </w:rPr>
+          <w:t>https://github.com/users/joelroth9802/projects/1</w:t>
+        </w:r>
+      </w:hyperlink>
+    </w:p>
+    <w:p>
+      <w:pPr>
+        <w:tabs>
+          <w:tab w:val="center" w:pos="4606"/>
+          <w:tab w:val="left" w:pos="6394"/>
+        </w:tabs>
+        <w:ind w:firstLine="0"/>
         <w:rPr>
           <w:rFonts w:ascii="Calibri" w:eastAsia="Calibri" w:hAnsi="Calibri" w:cs="Calibri"/>
           <w:b/>
@@ -399,42 +576,14 @@
         </w:rPr>
       </w:pPr>
       <w:r>
-        <w:rPr>
-          <w:rFonts w:ascii="Calibri" w:eastAsia="Calibri" w:hAnsi="Calibri" w:cs="Calibri"/>
-          <w:sz w:val="24"/>
-          <w:szCs w:val="24"/>
-        </w:rPr>
-        <w:t>14</w:t>
-      </w:r>
-      <w:r>
-        <w:rPr>
-          <w:rFonts w:ascii="Calibri" w:eastAsia="Calibri" w:hAnsi="Calibri" w:cs="Calibri"/>
-          <w:sz w:val="24"/>
-          <w:szCs w:val="24"/>
-        </w:rPr>
-        <w:t xml:space="preserve"> de </w:t>
-      </w:r>
-      <w:r>
-        <w:rPr>
-          <w:rFonts w:ascii="Calibri" w:eastAsia="Calibri" w:hAnsi="Calibri" w:cs="Calibri"/>
-          <w:sz w:val="24"/>
-          <w:szCs w:val="24"/>
-        </w:rPr>
-        <w:t>octubre</w:t>
-      </w:r>
-      <w:r>
-        <w:rPr>
-          <w:rFonts w:ascii="Calibri" w:eastAsia="Calibri" w:hAnsi="Calibri" w:cs="Calibri"/>
-          <w:sz w:val="24"/>
-          <w:szCs w:val="24"/>
-        </w:rPr>
-        <w:t xml:space="preserve"> de 2026</w:t>
-      </w:r>
-      <w:r>
         <w:br w:type="page"/>
       </w:r>
       <w:bookmarkStart w:id="0" w:name="_uw755rcfvytg" w:colFirst="0" w:colLast="0"/>
       <w:bookmarkEnd w:id="0"/>
+      <w:r>
+        <w:lastRenderedPageBreak/>
+        <w:tab/>
+      </w:r>
     </w:p>
     <w:sdt>
       <w:sdtPr>
@@ -493,7 +642,7 @@
           <w:r>
             <w:fldChar w:fldCharType="separate"/>
           </w:r>
-          <w:hyperlink w:anchor="_Toc243164928" w:history="1">
+          <w:hyperlink w:anchor="_Toc243313141" w:history="1">
             <w:r>
               <w:rPr>
                 <w:rStyle w:val="Hipervnculo"/>
@@ -521,7 +670,7 @@
                 <w:noProof/>
                 <w:webHidden/>
               </w:rPr>
-              <w:instrText xml:space="preserve"> PAGEREF _Toc243164928 \h </w:instrText>
+              <w:instrText xml:space="preserve"> PAGEREF _Toc243313141 \h </w:instrText>
             </w:r>
             <w:r>
               <w:rPr>
@@ -567,7 +716,7 @@
               <w14:ligatures w14:val="standardContextual"/>
             </w:rPr>
           </w:pPr>
-          <w:hyperlink w:anchor="_Toc243164929" w:history="1">
+          <w:hyperlink w:anchor="_Toc243313142" w:history="1">
             <w:r>
               <w:rPr>
                 <w:rStyle w:val="Hipervnculo"/>
@@ -595,7 +744,7 @@
                 <w:noProof/>
                 <w:webHidden/>
               </w:rPr>
-              <w:instrText xml:space="preserve"> PAGEREF _Toc243164929 \h </w:instrText>
+              <w:instrText xml:space="preserve"> PAGEREF _Toc243313142 \h </w:instrText>
             </w:r>
             <w:r>
               <w:rPr>
@@ -641,7 +790,7 @@
               <w14:ligatures w14:val="standardContextual"/>
             </w:rPr>
           </w:pPr>
-          <w:hyperlink w:anchor="_Toc243164930" w:history="1">
+          <w:hyperlink w:anchor="_Toc243313143" w:history="1">
             <w:r>
               <w:rPr>
                 <w:rStyle w:val="Hipervnculo"/>
@@ -669,7 +818,7 @@
                 <w:noProof/>
                 <w:webHidden/>
               </w:rPr>
-              <w:instrText xml:space="preserve"> PAGEREF _Toc243164930 \h </w:instrText>
+              <w:instrText xml:space="preserve"> PAGEREF _Toc243313143 \h </w:instrText>
             </w:r>
             <w:r>
               <w:rPr>
@@ -715,7 +864,7 @@
               <w14:ligatures w14:val="standardContextual"/>
             </w:rPr>
           </w:pPr>
-          <w:hyperlink w:anchor="_Toc243164931" w:history="1">
+          <w:hyperlink w:anchor="_Toc243313144" w:history="1">
             <w:r>
               <w:rPr>
                 <w:rStyle w:val="Hipervnculo"/>
@@ -743,7 +892,7 @@
                 <w:noProof/>
                 <w:webHidden/>
               </w:rPr>
-              <w:instrText xml:space="preserve"> PAGEREF _Toc243164931 \h </w:instrText>
+              <w:instrText xml:space="preserve"> PAGEREF _Toc243313144 \h </w:instrText>
             </w:r>
             <w:r>
               <w:rPr>
@@ -789,7 +938,7 @@
               <w14:ligatures w14:val="standardContextual"/>
             </w:rPr>
           </w:pPr>
-          <w:hyperlink w:anchor="_Toc243164932" w:history="1">
+          <w:hyperlink w:anchor="_Toc243313145" w:history="1">
             <w:r>
               <w:rPr>
                 <w:rStyle w:val="Hipervnculo"/>
@@ -817,7 +966,7 @@
                 <w:noProof/>
                 <w:webHidden/>
               </w:rPr>
-              <w:instrText xml:space="preserve"> PAGEREF _Toc243164932 \h </w:instrText>
+              <w:instrText xml:space="preserve"> PAGEREF _Toc243313145 \h </w:instrText>
             </w:r>
             <w:r>
               <w:rPr>
@@ -863,7 +1012,7 @@
               <w14:ligatures w14:val="standardContextual"/>
             </w:rPr>
           </w:pPr>
-          <w:hyperlink w:anchor="_Toc243164933" w:history="1">
+          <w:hyperlink w:anchor="_Toc243313146" w:history="1">
             <w:r>
               <w:rPr>
                 <w:rStyle w:val="Hipervnculo"/>
@@ -891,7 +1040,7 @@
                 <w:noProof/>
                 <w:webHidden/>
               </w:rPr>
-              <w:instrText xml:space="preserve"> PAGEREF _Toc243164933 \h </w:instrText>
+              <w:instrText xml:space="preserve"> PAGEREF _Toc243313146 \h </w:instrText>
             </w:r>
             <w:r>
               <w:rPr>
@@ -937,7 +1086,7 @@
               <w14:ligatures w14:val="standardContextual"/>
             </w:rPr>
           </w:pPr>
-          <w:hyperlink w:anchor="_Toc243164934" w:history="1">
+          <w:hyperlink w:anchor="_Toc243313147" w:history="1">
             <w:r>
               <w:rPr>
                 <w:rStyle w:val="Hipervnculo"/>
@@ -965,7 +1114,7 @@
                 <w:noProof/>
                 <w:webHidden/>
               </w:rPr>
-              <w:instrText xml:space="preserve"> PAGEREF _Toc243164934 \h </w:instrText>
+              <w:instrText xml:space="preserve"> PAGEREF _Toc243313147 \h </w:instrText>
             </w:r>
             <w:r>
               <w:rPr>
@@ -1011,7 +1160,7 @@
               <w14:ligatures w14:val="standardContextual"/>
             </w:rPr>
           </w:pPr>
-          <w:hyperlink w:anchor="_Toc243164935" w:history="1">
+          <w:hyperlink w:anchor="_Toc243313148" w:history="1">
             <w:r>
               <w:rPr>
                 <w:rStyle w:val="Hipervnculo"/>
@@ -1039,7 +1188,7 @@
                 <w:noProof/>
                 <w:webHidden/>
               </w:rPr>
-              <w:instrText xml:space="preserve"> PAGEREF _Toc243164935 \h </w:instrText>
+              <w:instrText xml:space="preserve"> PAGEREF _Toc243313148 \h </w:instrText>
             </w:r>
             <w:r>
               <w:rPr>
@@ -1085,7 +1234,7 @@
               <w14:ligatures w14:val="standardContextual"/>
             </w:rPr>
           </w:pPr>
-          <w:hyperlink w:anchor="_Toc243164936" w:history="1">
+          <w:hyperlink w:anchor="_Toc243313149" w:history="1">
             <w:r>
               <w:rPr>
                 <w:rStyle w:val="Hipervnculo"/>
@@ -1113,7 +1262,7 @@
                 <w:noProof/>
                 <w:webHidden/>
               </w:rPr>
-              <w:instrText xml:space="preserve"> PAGEREF _Toc243164936 \h </w:instrText>
+              <w:instrText xml:space="preserve"> PAGEREF _Toc243313149 \h </w:instrText>
             </w:r>
             <w:r>
               <w:rPr>
@@ -1159,7 +1308,7 @@
               <w14:ligatures w14:val="standardContextual"/>
             </w:rPr>
           </w:pPr>
-          <w:hyperlink w:anchor="_Toc243164937" w:history="1">
+          <w:hyperlink w:anchor="_Toc243313150" w:history="1">
             <w:r>
               <w:rPr>
                 <w:rStyle w:val="Hipervnculo"/>
@@ -1187,7 +1336,7 @@
                 <w:noProof/>
                 <w:webHidden/>
               </w:rPr>
-              <w:instrText xml:space="preserve"> PAGEREF _Toc243164937 \h </w:instrText>
+              <w:instrText xml:space="preserve"> PAGEREF _Toc243313150 \h </w:instrText>
             </w:r>
             <w:r>
               <w:rPr>
@@ -1233,7 +1382,7 @@
               <w14:ligatures w14:val="standardContextual"/>
             </w:rPr>
           </w:pPr>
-          <w:hyperlink w:anchor="_Toc243164938" w:history="1">
+          <w:hyperlink w:anchor="_Toc243313151" w:history="1">
             <w:r>
               <w:rPr>
                 <w:rStyle w:val="Hipervnculo"/>
@@ -1261,7 +1410,7 @@
                 <w:noProof/>
                 <w:webHidden/>
               </w:rPr>
-              <w:instrText xml:space="preserve"> PAGEREF _Toc243164938 \h </w:instrText>
+              <w:instrText xml:space="preserve"> PAGEREF _Toc243313151 \h </w:instrText>
             </w:r>
             <w:r>
               <w:rPr>
@@ -1282,6 +1431,154 @@
                 <w:webHidden/>
               </w:rPr>
               <w:t>19</w:t>
+            </w:r>
+            <w:r>
+              <w:rPr>
+                <w:noProof/>
+                <w:webHidden/>
+              </w:rPr>
+              <w:fldChar w:fldCharType="end"/>
+            </w:r>
+          </w:hyperlink>
+        </w:p>
+        <w:p>
+          <w:pPr>
+            <w:pStyle w:val="TDC2"/>
+            <w:tabs>
+              <w:tab w:val="right" w:leader="dot" w:pos="9203"/>
+            </w:tabs>
+            <w:rPr>
+              <w:rFonts w:asciiTheme="minorHAnsi" w:eastAsiaTheme="minorEastAsia" w:hAnsiTheme="minorHAnsi" w:cstheme="minorBidi"/>
+              <w:noProof/>
+              <w:kern w:val="2"/>
+              <w:sz w:val="24"/>
+              <w:szCs w:val="24"/>
+              <w14:ligatures w14:val="standardContextual"/>
+            </w:rPr>
+          </w:pPr>
+          <w:hyperlink w:anchor="_Toc243313152" w:history="1">
+            <w:r>
+              <w:rPr>
+                <w:rStyle w:val="Hipervnculo"/>
+                <w:rFonts w:eastAsia="Calibri"/>
+                <w:noProof/>
+              </w:rPr>
+              <w:t>Consigna 11</w:t>
+            </w:r>
+            <w:r>
+              <w:rPr>
+                <w:noProof/>
+                <w:webHidden/>
+              </w:rPr>
+              <w:tab/>
+            </w:r>
+            <w:r>
+              <w:rPr>
+                <w:noProof/>
+                <w:webHidden/>
+              </w:rPr>
+              <w:fldChar w:fldCharType="begin"/>
+            </w:r>
+            <w:r>
+              <w:rPr>
+                <w:noProof/>
+                <w:webHidden/>
+              </w:rPr>
+              <w:instrText xml:space="preserve"> PAGEREF _Toc243313152 \h </w:instrText>
+            </w:r>
+            <w:r>
+              <w:rPr>
+                <w:noProof/>
+                <w:webHidden/>
+              </w:rPr>
+            </w:r>
+            <w:r>
+              <w:rPr>
+                <w:noProof/>
+                <w:webHidden/>
+              </w:rPr>
+              <w:fldChar w:fldCharType="separate"/>
+            </w:r>
+            <w:r>
+              <w:rPr>
+                <w:noProof/>
+                <w:webHidden/>
+              </w:rPr>
+              <w:t>20</w:t>
+            </w:r>
+            <w:r>
+              <w:rPr>
+                <w:noProof/>
+                <w:webHidden/>
+              </w:rPr>
+              <w:fldChar w:fldCharType="end"/>
+            </w:r>
+          </w:hyperlink>
+        </w:p>
+        <w:p>
+          <w:pPr>
+            <w:pStyle w:val="TDC2"/>
+            <w:tabs>
+              <w:tab w:val="right" w:leader="dot" w:pos="9203"/>
+            </w:tabs>
+            <w:rPr>
+              <w:rFonts w:asciiTheme="minorHAnsi" w:eastAsiaTheme="minorEastAsia" w:hAnsiTheme="minorHAnsi" w:cstheme="minorBidi"/>
+              <w:noProof/>
+              <w:kern w:val="2"/>
+              <w:sz w:val="24"/>
+              <w:szCs w:val="24"/>
+              <w14:ligatures w14:val="standardContextual"/>
+            </w:rPr>
+          </w:pPr>
+          <w:hyperlink w:anchor="_Toc243313153" w:history="1">
+            <w:r>
+              <w:rPr>
+                <w:rStyle w:val="Hipervnculo"/>
+                <w:rFonts w:eastAsia="Calibri"/>
+                <w:noProof/>
+              </w:rPr>
+              <w:t>Consigna 12</w:t>
+            </w:r>
+            <w:r>
+              <w:rPr>
+                <w:noProof/>
+                <w:webHidden/>
+              </w:rPr>
+              <w:tab/>
+            </w:r>
+            <w:r>
+              <w:rPr>
+                <w:noProof/>
+                <w:webHidden/>
+              </w:rPr>
+              <w:fldChar w:fldCharType="begin"/>
+            </w:r>
+            <w:r>
+              <w:rPr>
+                <w:noProof/>
+                <w:webHidden/>
+              </w:rPr>
+              <w:instrText xml:space="preserve"> PAGEREF _Toc243313153 \h </w:instrText>
+            </w:r>
+            <w:r>
+              <w:rPr>
+                <w:noProof/>
+                <w:webHidden/>
+              </w:rPr>
+            </w:r>
+            <w:r>
+              <w:rPr>
+                <w:noProof/>
+                <w:webHidden/>
+              </w:rPr>
+              <w:fldChar w:fldCharType="separate"/>
+            </w:r>
+            <w:r>
+              <w:rPr>
+                <w:noProof/>
+                <w:webHidden/>
+              </w:rPr>
+              <w:t>22</w:t>
             </w:r>
             <w:r>
               <w:rPr>
@@ -1307,7 +1604,7 @@
               <w14:ligatures w14:val="standardContextual"/>
             </w:rPr>
           </w:pPr>
-          <w:hyperlink w:anchor="_Toc243164939" w:history="1">
+          <w:hyperlink w:anchor="_Toc243313154" w:history="1">
             <w:r>
               <w:rPr>
                 <w:rStyle w:val="Hipervnculo"/>
@@ -1335,7 +1632,7 @@
                 <w:noProof/>
                 <w:webHidden/>
               </w:rPr>
-              <w:instrText xml:space="preserve"> PAGEREF _Toc243164939 \h </w:instrText>
+              <w:instrText xml:space="preserve"> PAGEREF _Toc243313154 \h </w:instrText>
             </w:r>
             <w:r>
               <w:rPr>
@@ -1355,7 +1652,7 @@
                 <w:noProof/>
                 <w:webHidden/>
               </w:rPr>
-              <w:t>20</w:t>
+              <w:t>23</w:t>
             </w:r>
             <w:r>
               <w:rPr>
@@ -1381,7 +1678,7 @@
               <w14:ligatures w14:val="standardContextual"/>
             </w:rPr>
           </w:pPr>
-          <w:hyperlink w:anchor="_Toc243164940" w:history="1">
+          <w:hyperlink w:anchor="_Toc243313155" w:history="1">
             <w:r>
               <w:rPr>
                 <w:rStyle w:val="Hipervnculo"/>
@@ -1408,7 +1705,7 @@
                 <w:noProof/>
                 <w:webHidden/>
               </w:rPr>
-              <w:instrText xml:space="preserve"> PAGEREF _Toc243164940 \h </w:instrText>
+              <w:instrText xml:space="preserve"> PAGEREF _Toc243313155 \h </w:instrText>
             </w:r>
             <w:r>
               <w:rPr>
@@ -1428,7 +1725,7 @@
                 <w:noProof/>
                 <w:webHidden/>
               </w:rPr>
-              <w:t>21</w:t>
+              <w:t>23</w:t>
             </w:r>
             <w:r>
               <w:rPr>
@@ -1810,7 +2107,7 @@
         </w:rPr>
       </w:pPr>
       <w:bookmarkStart w:id="6" w:name="_r0e5mxkz2ax5" w:colFirst="0" w:colLast="0"/>
-      <w:bookmarkStart w:id="7" w:name="_Toc243164928"/>
+      <w:bookmarkStart w:id="7" w:name="_Toc243313141"/>
       <w:bookmarkEnd w:id="6"/>
       <w:r>
         <w:rPr>
@@ -2366,11 +2663,33 @@
         </w:rPr>
         <w:t xml:space="preserve"> </w:t>
       </w:r>
-      <w:r>
-        <w:rPr>
-          <w:rFonts w:ascii="Arial" w:hAnsi="Arial" w:cs="Arial"/>
-        </w:rPr>
-        <w:t>Integer, Boolean, etc.) y una breve Descripción funcional.</w:t>
+      <w:proofErr w:type="spellStart"/>
+      <w:r>
+        <w:rPr>
+          <w:rFonts w:ascii="Arial" w:hAnsi="Arial" w:cs="Arial"/>
+        </w:rPr>
+        <w:t>Integer</w:t>
+      </w:r>
+      <w:proofErr w:type="spellEnd"/>
+      <w:r>
+        <w:rPr>
+          <w:rFonts w:ascii="Arial" w:hAnsi="Arial" w:cs="Arial"/>
+        </w:rPr>
+        <w:t xml:space="preserve">, </w:t>
+      </w:r>
+      <w:proofErr w:type="spellStart"/>
+      <w:r>
+        <w:rPr>
+          <w:rFonts w:ascii="Arial" w:hAnsi="Arial" w:cs="Arial"/>
+        </w:rPr>
+        <w:t>Boolean</w:t>
+      </w:r>
+      <w:proofErr w:type="spellEnd"/>
+      <w:r>
+        <w:rPr>
+          <w:rFonts w:ascii="Arial" w:hAnsi="Arial" w:cs="Arial"/>
+        </w:rPr>
+        <w:t>, etc.) y una breve Descripción funcional.</w:t>
       </w:r>
     </w:p>
     <w:p>
@@ -2515,7 +2834,35 @@
         <w:rPr>
           <w:rFonts w:ascii="Arial" w:hAnsi="Arial" w:cs="Arial"/>
         </w:rPr>
-        <w:t>obligatorio de ramas secundarias (branches), mensajes de commit descriptivos y profesionales, y la gestión y</w:t>
+        <w:t>obligatorio de ramas secundarias (</w:t>
+      </w:r>
+      <w:proofErr w:type="spellStart"/>
+      <w:r>
+        <w:rPr>
+          <w:rFonts w:ascii="Arial" w:hAnsi="Arial" w:cs="Arial"/>
+        </w:rPr>
+        <w:t>branches</w:t>
+      </w:r>
+      <w:proofErr w:type="spellEnd"/>
+      <w:r>
+        <w:rPr>
+          <w:rFonts w:ascii="Arial" w:hAnsi="Arial" w:cs="Arial"/>
+        </w:rPr>
+        <w:t xml:space="preserve">), mensajes de </w:t>
+      </w:r>
+      <w:proofErr w:type="spellStart"/>
+      <w:r>
+        <w:rPr>
+          <w:rFonts w:ascii="Arial" w:hAnsi="Arial" w:cs="Arial"/>
+        </w:rPr>
+        <w:t>commit</w:t>
+      </w:r>
+      <w:proofErr w:type="spellEnd"/>
+      <w:r>
+        <w:rPr>
+          <w:rFonts w:ascii="Arial" w:hAnsi="Arial" w:cs="Arial"/>
+        </w:rPr>
+        <w:t xml:space="preserve"> descriptivos y profesionales, y la gestión y</w:t>
       </w:r>
       <w:r>
         <w:rPr>
@@ -2527,7 +2874,21 @@
         <w:rPr>
           <w:rFonts w:ascii="Arial" w:hAnsi="Arial" w:cs="Arial"/>
         </w:rPr>
-        <w:t>resolución de al menos un Pull Request (PR) con revisión de pares.</w:t>
+        <w:t xml:space="preserve">resolución de al menos un Pull </w:t>
+      </w:r>
+      <w:proofErr w:type="spellStart"/>
+      <w:r>
+        <w:rPr>
+          <w:rFonts w:ascii="Arial" w:hAnsi="Arial" w:cs="Arial"/>
+        </w:rPr>
+        <w:t>Request</w:t>
+      </w:r>
+      <w:proofErr w:type="spellEnd"/>
+      <w:r>
+        <w:rPr>
+          <w:rFonts w:ascii="Arial" w:hAnsi="Arial" w:cs="Arial"/>
+        </w:rPr>
+        <w:t xml:space="preserve"> (PR) con revisión de pares.</w:t>
       </w:r>
     </w:p>
     <w:p>
@@ -2569,7 +2930,21 @@
         <w:rPr>
           <w:rFonts w:ascii="Arial" w:hAnsi="Arial" w:cs="Arial"/>
         </w:rPr>
-        <w:t>o GitHub Projects). Vincular las tres Historias de Usuario previamente definidas en formato formal ("Como</w:t>
+        <w:t xml:space="preserve">o GitHub </w:t>
+      </w:r>
+      <w:proofErr w:type="spellStart"/>
+      <w:r>
+        <w:rPr>
+          <w:rFonts w:ascii="Arial" w:hAnsi="Arial" w:cs="Arial"/>
+        </w:rPr>
+        <w:t>Projects</w:t>
+      </w:r>
+      <w:proofErr w:type="spellEnd"/>
+      <w:r>
+        <w:rPr>
+          <w:rFonts w:ascii="Arial" w:hAnsi="Arial" w:cs="Arial"/>
+        </w:rPr>
+        <w:t>). Vincular las tres Historias de Usuario previamente definidas en formato formal ("Como</w:t>
       </w:r>
       <w:r>
         <w:rPr>
@@ -2647,7 +3022,21 @@
         <w:rPr>
           <w:rFonts w:ascii="Arial" w:hAnsi="Arial" w:cs="Arial"/>
         </w:rPr>
-        <w:t>Uso de IA" en el README.md que justifique críticamente los prompts utilizados para estructurar el trabajo y</w:t>
+        <w:t xml:space="preserve">Uso de IA" en el README.md que justifique críticamente los </w:t>
+      </w:r>
+      <w:proofErr w:type="spellStart"/>
+      <w:r>
+        <w:rPr>
+          <w:rFonts w:ascii="Arial" w:hAnsi="Arial" w:cs="Arial"/>
+        </w:rPr>
+        <w:t>prompts</w:t>
+      </w:r>
+      <w:proofErr w:type="spellEnd"/>
+      <w:r>
+        <w:rPr>
+          <w:rFonts w:ascii="Arial" w:hAnsi="Arial" w:cs="Arial"/>
+        </w:rPr>
+        <w:t xml:space="preserve"> utilizados para estructurar el trabajo y</w:t>
       </w:r>
       <w:r>
         <w:rPr>
@@ -2912,7 +3301,7 @@
         </w:rPr>
       </w:pPr>
       <w:bookmarkStart w:id="9" w:name="_axdhasng3xsp" w:colFirst="0" w:colLast="0"/>
-      <w:bookmarkStart w:id="10" w:name="_Toc243164929"/>
+      <w:bookmarkStart w:id="10" w:name="_Toc243313142"/>
       <w:bookmarkEnd w:id="9"/>
       <w:r>
         <w:rPr>
@@ -2931,7 +3320,7 @@
         </w:rPr>
       </w:pPr>
       <w:bookmarkStart w:id="11" w:name="_u4cygbaeh2en" w:colFirst="0" w:colLast="0"/>
-      <w:bookmarkStart w:id="12" w:name="_Toc243164930"/>
+      <w:bookmarkStart w:id="12" w:name="_Toc243313143"/>
       <w:bookmarkEnd w:id="11"/>
       <w:r>
         <w:rPr>
@@ -3297,7 +3686,7 @@
         </w:rPr>
       </w:pPr>
       <w:bookmarkStart w:id="14" w:name="_m6fqjbbv6iq2" w:colFirst="0" w:colLast="0"/>
-      <w:bookmarkStart w:id="15" w:name="_Toc243164931"/>
+      <w:bookmarkStart w:id="15" w:name="_Toc243313144"/>
       <w:bookmarkEnd w:id="14"/>
       <w:r>
         <w:rPr>
@@ -4582,7 +4971,23 @@
           <w:rFonts w:ascii="Arial" w:eastAsia="Calibri" w:hAnsi="Arial" w:cs="Arial"/>
           <w:color w:val="000000"/>
         </w:rPr>
-        <w:t xml:space="preserve"> Computadoras reacondicionadas, computadoras personalizadas, facturas de ventas, garantías, equipos para servidores, streaming, edición de videos y gaming.</w:t>
+        <w:t xml:space="preserve"> Computadoras reacondicionadas, computadoras personalizadas, facturas de ventas, garantías, equipos para servidores, streaming, edición de videos y </w:t>
+      </w:r>
+      <w:proofErr w:type="spellStart"/>
+      <w:r>
+        <w:rPr>
+          <w:rFonts w:ascii="Arial" w:eastAsia="Calibri" w:hAnsi="Arial" w:cs="Arial"/>
+          <w:color w:val="000000"/>
+        </w:rPr>
+        <w:t>gaming</w:t>
+      </w:r>
+      <w:proofErr w:type="spellEnd"/>
+      <w:r>
+        <w:rPr>
+          <w:rFonts w:ascii="Arial" w:eastAsia="Calibri" w:hAnsi="Arial" w:cs="Arial"/>
+          <w:color w:val="000000"/>
+        </w:rPr>
+        <w:t>.</w:t>
       </w:r>
     </w:p>
     <w:p>
@@ -4764,7 +5169,7 @@
                     </pic:cNvPicPr>
                   </pic:nvPicPr>
                   <pic:blipFill>
-                    <a:blip r:embed="rId8">
+                    <a:blip r:embed="rId10">
                       <a:extLst>
                         <a:ext uri="{28A0092B-C50C-407E-A947-70E740481C1C}">
                           <a14:useLocalDpi xmlns:a14="http://schemas.microsoft.com/office/drawing/2010/main" val="0"/>
@@ -5128,7 +5533,7 @@
           <w:rFonts w:eastAsia="Calibri"/>
         </w:rPr>
       </w:pPr>
-      <w:bookmarkStart w:id="17" w:name="_Toc243164932"/>
+      <w:bookmarkStart w:id="17" w:name="_Toc243313145"/>
       <w:r>
         <w:rPr>
           <w:rFonts w:eastAsia="Calibri"/>
@@ -5567,7 +5972,7 @@
           <w:rFonts w:eastAsia="Calibri"/>
         </w:rPr>
       </w:pPr>
-      <w:bookmarkStart w:id="18" w:name="_Toc243164933"/>
+      <w:bookmarkStart w:id="18" w:name="_Toc243313146"/>
       <w:r>
         <w:rPr>
           <w:rFonts w:eastAsia="Calibri"/>
@@ -6705,7 +7110,27 @@
                 <w:iCs/>
                 <w:color w:val="000000"/>
               </w:rPr>
-              <w:t>Uso de tecnologías de código abierto para la disponibilidad de frameworks y bases de datos gratuitas.</w:t>
+              <w:t xml:space="preserve">Uso de tecnologías de código abierto para la disponibilidad de </w:t>
+            </w:r>
+            <w:proofErr w:type="spellStart"/>
+            <w:r>
+              <w:rPr>
+                <w:rFonts w:ascii="Arial" w:eastAsia="Calibri" w:hAnsi="Arial" w:cs="Arial"/>
+                <w:bCs/>
+                <w:iCs/>
+                <w:color w:val="000000"/>
+              </w:rPr>
+              <w:t>frameworks</w:t>
+            </w:r>
+            <w:proofErr w:type="spellEnd"/>
+            <w:r>
+              <w:rPr>
+                <w:rFonts w:ascii="Arial" w:eastAsia="Calibri" w:hAnsi="Arial" w:cs="Arial"/>
+                <w:bCs/>
+                <w:iCs/>
+                <w:color w:val="000000"/>
+              </w:rPr>
+              <w:t xml:space="preserve"> y bases de datos gratuitas.</w:t>
             </w:r>
           </w:p>
           <w:p>
@@ -6759,7 +7184,27 @@
                 <w:iCs/>
                 <w:color w:val="000000"/>
               </w:rPr>
-              <w:t>Auge de las computadoras personalizadas y nuevos componentes por parte de los creadores de contenido y streamers.</w:t>
+              <w:t xml:space="preserve">Auge de las computadoras personalizadas y nuevos componentes por parte de los creadores de contenido y </w:t>
+            </w:r>
+            <w:proofErr w:type="spellStart"/>
+            <w:r>
+              <w:rPr>
+                <w:rFonts w:ascii="Arial" w:eastAsia="Calibri" w:hAnsi="Arial" w:cs="Arial"/>
+                <w:bCs/>
+                <w:iCs/>
+                <w:color w:val="000000"/>
+              </w:rPr>
+              <w:t>streamers</w:t>
+            </w:r>
+            <w:proofErr w:type="spellEnd"/>
+            <w:r>
+              <w:rPr>
+                <w:rFonts w:ascii="Arial" w:eastAsia="Calibri" w:hAnsi="Arial" w:cs="Arial"/>
+                <w:bCs/>
+                <w:iCs/>
+                <w:color w:val="000000"/>
+              </w:rPr>
+              <w:t>.</w:t>
             </w:r>
           </w:p>
         </w:tc>
@@ -7067,7 +7512,7 @@
           <w:rFonts w:eastAsia="Calibri"/>
         </w:rPr>
       </w:pPr>
-      <w:bookmarkStart w:id="19" w:name="_Toc243164934"/>
+      <w:bookmarkStart w:id="19" w:name="_Toc243313147"/>
       <w:r>
         <w:rPr>
           <w:rFonts w:eastAsia="Calibri"/>
@@ -7587,7 +8032,27 @@
           <w:iCs/>
           <w:color w:val="000000"/>
         </w:rPr>
-        <w:t xml:space="preserve">Completar el desarrollo, testing e implementación del programa en un plazo </w:t>
+        <w:t xml:space="preserve">Completar el desarrollo, </w:t>
+      </w:r>
+      <w:proofErr w:type="spellStart"/>
+      <w:r>
+        <w:rPr>
+          <w:rFonts w:ascii="Arial" w:eastAsia="Calibri" w:hAnsi="Arial" w:cs="Arial"/>
+          <w:bCs/>
+          <w:iCs/>
+          <w:color w:val="000000"/>
+        </w:rPr>
+        <w:t>testing</w:t>
+      </w:r>
+      <w:proofErr w:type="spellEnd"/>
+      <w:r>
+        <w:rPr>
+          <w:rFonts w:ascii="Arial" w:eastAsia="Calibri" w:hAnsi="Arial" w:cs="Arial"/>
+          <w:bCs/>
+          <w:iCs/>
+          <w:color w:val="000000"/>
+        </w:rPr>
+        <w:t xml:space="preserve"> e implementación del programa en un plazo </w:t>
       </w:r>
       <w:r>
         <w:rPr>
@@ -7872,10 +8337,10 @@
           <w:rFonts w:eastAsia="Calibri"/>
         </w:rPr>
         <w:sectPr>
-          <w:headerReference w:type="default" r:id="rId9"/>
-          <w:footerReference w:type="default" r:id="rId10"/>
-          <w:headerReference w:type="first" r:id="rId11"/>
-          <w:footerReference w:type="first" r:id="rId12"/>
+          <w:headerReference w:type="default" r:id="rId11"/>
+          <w:footerReference w:type="default" r:id="rId12"/>
+          <w:headerReference w:type="first" r:id="rId13"/>
+          <w:footerReference w:type="first" r:id="rId14"/>
           <w:pgSz w:w="12240" w:h="15840"/>
           <w:pgMar w:top="1440" w:right="1587" w:bottom="1440" w:left="1440" w:header="720" w:footer="720" w:gutter="0"/>
           <w:pgNumType w:start="1"/>
@@ -7891,7 +8356,7 @@
           <w:rFonts w:eastAsia="Calibri"/>
         </w:rPr>
       </w:pPr>
-      <w:bookmarkStart w:id="20" w:name="_Toc243164935"/>
+      <w:bookmarkStart w:id="20" w:name="_Toc243313148"/>
       <w:r>
         <w:rPr>
           <w:rFonts w:eastAsia="Calibri"/>
@@ -7981,7 +8446,7 @@
                     </pic:cNvPicPr>
                   </pic:nvPicPr>
                   <pic:blipFill>
-                    <a:blip r:embed="rId13">
+                    <a:blip r:embed="rId15">
                       <a:extLst>
                         <a:ext uri="{28A0092B-C50C-407E-A947-70E740481C1C}">
                           <a14:useLocalDpi xmlns:a14="http://schemas.microsoft.com/office/drawing/2010/main" val="0"/>
@@ -8068,7 +8533,7 @@
           <w:rFonts w:eastAsia="Calibri"/>
         </w:rPr>
       </w:pPr>
-      <w:bookmarkStart w:id="21" w:name="_Toc243164936"/>
+      <w:bookmarkStart w:id="21" w:name="_Toc243313149"/>
       <w:r>
         <w:rPr>
           <w:rFonts w:eastAsia="Calibri"/>
@@ -8162,7 +8627,7 @@
                     </pic:cNvPicPr>
                   </pic:nvPicPr>
                   <pic:blipFill>
-                    <a:blip r:embed="rId14" cstate="print">
+                    <a:blip r:embed="rId16" cstate="print">
                       <a:extLst>
                         <a:ext uri="{28A0092B-C50C-407E-A947-70E740481C1C}">
                           <a14:useLocalDpi xmlns:a14="http://schemas.microsoft.com/office/drawing/2010/main" val="0"/>
@@ -8268,7 +8733,27 @@
           <w:iCs/>
           <w:color w:val="000000"/>
         </w:rPr>
-        <w:t>Se adopta una estructura formal de tipo vertical/piramidal encabezada por la Gerencia General/Dueño, lo cual es característico de las PyMEs. Permite centralizar la conducción estratégica y asegurar líneas de mando claras.</w:t>
+        <w:t xml:space="preserve">Se adopta una estructura formal de tipo vertical/piramidal encabezada por la Gerencia General/Dueño, lo cual es característico de las </w:t>
+      </w:r>
+      <w:proofErr w:type="spellStart"/>
+      <w:r>
+        <w:rPr>
+          <w:rFonts w:ascii="Arial" w:eastAsia="Calibri" w:hAnsi="Arial" w:cs="Arial"/>
+          <w:bCs/>
+          <w:iCs/>
+          <w:color w:val="000000"/>
+        </w:rPr>
+        <w:t>PyMEs</w:t>
+      </w:r>
+      <w:proofErr w:type="spellEnd"/>
+      <w:r>
+        <w:rPr>
+          <w:rFonts w:ascii="Arial" w:eastAsia="Calibri" w:hAnsi="Arial" w:cs="Arial"/>
+          <w:bCs/>
+          <w:iCs/>
+          <w:color w:val="000000"/>
+        </w:rPr>
+        <w:t>. Permite centralizar la conducción estratégica y asegurar líneas de mando claras.</w:t>
       </w:r>
     </w:p>
     <w:p>
@@ -8415,7 +8900,27 @@
           <w:iCs/>
           <w:color w:val="000000"/>
         </w:rPr>
-        <w:t>En el organigrama no se contemplan órganos de staff porque, al tratarse de una PyME de reacondicionamiento y comercialización tecnológica en etapa de crecimiento, las funciones de asesoramiento externo (como servicios legales, contables externos o consultorías) son tercerizadas puntualmente o asumidas de manera directa por la Dirección General</w:t>
+        <w:t xml:space="preserve">En el organigrama no se contemplan órganos de staff porque, al tratarse de una </w:t>
+      </w:r>
+      <w:proofErr w:type="spellStart"/>
+      <w:r>
+        <w:rPr>
+          <w:rFonts w:ascii="Arial" w:eastAsia="Calibri" w:hAnsi="Arial" w:cs="Arial"/>
+          <w:bCs/>
+          <w:iCs/>
+          <w:color w:val="000000"/>
+        </w:rPr>
+        <w:t>PyME</w:t>
+      </w:r>
+      <w:proofErr w:type="spellEnd"/>
+      <w:r>
+        <w:rPr>
+          <w:rFonts w:ascii="Arial" w:eastAsia="Calibri" w:hAnsi="Arial" w:cs="Arial"/>
+          <w:bCs/>
+          <w:iCs/>
+          <w:color w:val="000000"/>
+        </w:rPr>
+        <w:t xml:space="preserve"> de reacondicionamiento y comercialización tecnológica en etapa de crecimiento, las funciones de asesoramiento externo (como servicios legales, contables externos o consultorías) son tercerizadas puntualmente o asumidas de manera directa por la Dirección General</w:t>
       </w:r>
       <w:r>
         <w:rPr>
@@ -8480,7 +8985,7 @@
           <w:rFonts w:eastAsia="Calibri"/>
         </w:rPr>
       </w:pPr>
-      <w:bookmarkStart w:id="22" w:name="_Toc243164937"/>
+      <w:bookmarkStart w:id="22" w:name="_Toc243313150"/>
       <w:r>
         <w:rPr>
           <w:rFonts w:eastAsia="Calibri"/>
@@ -8732,6 +9237,7 @@
                 <w:color w:val="000000"/>
               </w:rPr>
             </w:pPr>
+            <w:proofErr w:type="spellStart"/>
             <w:r>
               <w:rPr>
                 <w:rFonts w:ascii="Arial" w:eastAsia="Calibri" w:hAnsi="Arial" w:cs="Arial"/>
@@ -8741,6 +9247,7 @@
               </w:rPr>
               <w:t>id_componente</w:t>
             </w:r>
+            <w:proofErr w:type="spellEnd"/>
           </w:p>
         </w:tc>
         <w:tc>
@@ -8760,6 +9267,7 @@
                 <w:color w:val="000000"/>
               </w:rPr>
             </w:pPr>
+            <w:proofErr w:type="spellStart"/>
             <w:r>
               <w:rPr>
                 <w:rFonts w:ascii="Arial" w:eastAsia="Calibri" w:hAnsi="Arial" w:cs="Arial"/>
@@ -8769,6 +9277,7 @@
               </w:rPr>
               <w:t>Integer</w:t>
             </w:r>
+            <w:proofErr w:type="spellEnd"/>
           </w:p>
         </w:tc>
         <w:tc>
@@ -8999,6 +9508,7 @@
                 <w:color w:val="000000"/>
               </w:rPr>
             </w:pPr>
+            <w:proofErr w:type="spellStart"/>
             <w:r>
               <w:rPr>
                 <w:rFonts w:ascii="Arial" w:eastAsia="Calibri" w:hAnsi="Arial" w:cs="Arial"/>
@@ -9008,6 +9518,7 @@
               </w:rPr>
               <w:t>stock_actual</w:t>
             </w:r>
+            <w:proofErr w:type="spellEnd"/>
           </w:p>
         </w:tc>
         <w:tc>
@@ -9027,6 +9538,7 @@
                 <w:color w:val="000000"/>
               </w:rPr>
             </w:pPr>
+            <w:proofErr w:type="spellStart"/>
             <w:r>
               <w:rPr>
                 <w:rFonts w:ascii="Arial" w:eastAsia="Calibri" w:hAnsi="Arial" w:cs="Arial"/>
@@ -9036,6 +9548,7 @@
               </w:rPr>
               <w:t>Integer</w:t>
             </w:r>
+            <w:proofErr w:type="spellEnd"/>
           </w:p>
         </w:tc>
         <w:tc>
@@ -9088,6 +9601,7 @@
                 <w:color w:val="000000"/>
               </w:rPr>
             </w:pPr>
+            <w:proofErr w:type="spellStart"/>
             <w:r>
               <w:rPr>
                 <w:rFonts w:ascii="Arial" w:eastAsia="Calibri" w:hAnsi="Arial" w:cs="Arial"/>
@@ -9097,6 +9611,7 @@
               </w:rPr>
               <w:t>Id_proveedor</w:t>
             </w:r>
+            <w:proofErr w:type="spellEnd"/>
           </w:p>
         </w:tc>
         <w:tc>
@@ -9116,6 +9631,7 @@
                 <w:color w:val="000000"/>
               </w:rPr>
             </w:pPr>
+            <w:proofErr w:type="spellStart"/>
             <w:r>
               <w:rPr>
                 <w:rFonts w:ascii="Arial" w:eastAsia="Calibri" w:hAnsi="Arial" w:cs="Arial"/>
@@ -9125,6 +9641,7 @@
               </w:rPr>
               <w:t>Integer</w:t>
             </w:r>
+            <w:proofErr w:type="spellEnd"/>
           </w:p>
         </w:tc>
         <w:tc>
@@ -9509,6 +10026,7 @@
                 <w:color w:val="000000"/>
               </w:rPr>
             </w:pPr>
+            <w:proofErr w:type="spellStart"/>
             <w:r>
               <w:rPr>
                 <w:rFonts w:ascii="Arial" w:eastAsia="Calibri" w:hAnsi="Arial" w:cs="Arial"/>
@@ -9518,6 +10036,7 @@
               </w:rPr>
               <w:t>id_proveedor</w:t>
             </w:r>
+            <w:proofErr w:type="spellEnd"/>
           </w:p>
         </w:tc>
         <w:tc>
@@ -9537,6 +10056,7 @@
                 <w:color w:val="000000"/>
               </w:rPr>
             </w:pPr>
+            <w:proofErr w:type="spellStart"/>
             <w:r>
               <w:rPr>
                 <w:rFonts w:ascii="Arial" w:eastAsia="Calibri" w:hAnsi="Arial" w:cs="Arial"/>
@@ -9546,6 +10066,7 @@
               </w:rPr>
               <w:t>Integer</w:t>
             </w:r>
+            <w:proofErr w:type="spellEnd"/>
           </w:p>
         </w:tc>
         <w:tc>
@@ -9595,6 +10116,7 @@
                 <w:color w:val="000000"/>
               </w:rPr>
             </w:pPr>
+            <w:proofErr w:type="spellStart"/>
             <w:r>
               <w:rPr>
                 <w:rFonts w:ascii="Arial" w:eastAsia="Calibri" w:hAnsi="Arial" w:cs="Arial"/>
@@ -9604,6 +10126,7 @@
               </w:rPr>
               <w:t>nombre_empresa</w:t>
             </w:r>
+            <w:proofErr w:type="spellEnd"/>
           </w:p>
         </w:tc>
         <w:tc>
@@ -9690,6 +10213,7 @@
                 <w:color w:val="000000"/>
               </w:rPr>
             </w:pPr>
+            <w:proofErr w:type="spellStart"/>
             <w:r>
               <w:rPr>
                 <w:rFonts w:ascii="Arial" w:eastAsia="Calibri" w:hAnsi="Arial" w:cs="Arial"/>
@@ -9699,6 +10223,7 @@
               </w:rPr>
               <w:t>telefono</w:t>
             </w:r>
+            <w:proofErr w:type="spellEnd"/>
           </w:p>
         </w:tc>
         <w:tc>
@@ -9776,6 +10301,7 @@
                 <w:color w:val="000000"/>
               </w:rPr>
             </w:pPr>
+            <w:proofErr w:type="spellStart"/>
             <w:r>
               <w:rPr>
                 <w:rFonts w:ascii="Arial" w:eastAsia="Calibri" w:hAnsi="Arial" w:cs="Arial"/>
@@ -9785,6 +10311,7 @@
               </w:rPr>
               <w:t>tipo_insumo</w:t>
             </w:r>
+            <w:proofErr w:type="spellEnd"/>
           </w:p>
         </w:tc>
         <w:tc>
@@ -10126,6 +10653,7 @@
         </w:rPr>
         <w:t xml:space="preserve">Entidad: </w:t>
       </w:r>
+      <w:proofErr w:type="spellStart"/>
       <w:r>
         <w:rPr>
           <w:rFonts w:ascii="Arial" w:eastAsia="Calibri" w:hAnsi="Arial" w:cs="Arial"/>
@@ -10135,6 +10663,7 @@
         </w:rPr>
         <w:t>MovimientoStock</w:t>
       </w:r>
+      <w:proofErr w:type="spellEnd"/>
     </w:p>
     <w:p>
       <w:pPr>
@@ -10281,6 +10810,7 @@
                 <w:color w:val="000000"/>
               </w:rPr>
             </w:pPr>
+            <w:proofErr w:type="spellStart"/>
             <w:r>
               <w:rPr>
                 <w:rFonts w:ascii="Arial" w:eastAsia="Calibri" w:hAnsi="Arial" w:cs="Arial"/>
@@ -10290,6 +10820,7 @@
               </w:rPr>
               <w:t>id_movimiento</w:t>
             </w:r>
+            <w:proofErr w:type="spellEnd"/>
           </w:p>
         </w:tc>
         <w:tc>
@@ -10309,6 +10840,7 @@
                 <w:color w:val="000000"/>
               </w:rPr>
             </w:pPr>
+            <w:proofErr w:type="spellStart"/>
             <w:r>
               <w:rPr>
                 <w:rFonts w:ascii="Arial" w:eastAsia="Calibri" w:hAnsi="Arial" w:cs="Arial"/>
@@ -10318,6 +10850,7 @@
               </w:rPr>
               <w:t>Integer</w:t>
             </w:r>
+            <w:proofErr w:type="spellEnd"/>
           </w:p>
         </w:tc>
         <w:tc>
@@ -10367,6 +10900,7 @@
                 <w:color w:val="000000"/>
               </w:rPr>
             </w:pPr>
+            <w:proofErr w:type="spellStart"/>
             <w:r>
               <w:rPr>
                 <w:rFonts w:ascii="Arial" w:eastAsia="Calibri" w:hAnsi="Arial" w:cs="Arial"/>
@@ -10376,6 +10910,7 @@
               </w:rPr>
               <w:t>tipo_operacion</w:t>
             </w:r>
+            <w:proofErr w:type="spellEnd"/>
           </w:p>
         </w:tc>
         <w:tc>
@@ -10453,6 +10988,7 @@
                 <w:color w:val="000000"/>
               </w:rPr>
             </w:pPr>
+            <w:proofErr w:type="spellStart"/>
             <w:r>
               <w:rPr>
                 <w:rFonts w:ascii="Arial" w:eastAsia="Calibri" w:hAnsi="Arial" w:cs="Arial"/>
@@ -10462,6 +10998,7 @@
               </w:rPr>
               <w:t>fecha_movimiento</w:t>
             </w:r>
+            <w:proofErr w:type="spellEnd"/>
           </w:p>
         </w:tc>
         <w:tc>
@@ -10567,6 +11104,7 @@
                 <w:color w:val="000000"/>
               </w:rPr>
             </w:pPr>
+            <w:proofErr w:type="spellStart"/>
             <w:r>
               <w:rPr>
                 <w:rFonts w:ascii="Arial" w:eastAsia="Calibri" w:hAnsi="Arial" w:cs="Arial"/>
@@ -10576,6 +11114,7 @@
               </w:rPr>
               <w:t>Integer</w:t>
             </w:r>
+            <w:proofErr w:type="spellEnd"/>
           </w:p>
         </w:tc>
         <w:tc>
@@ -10625,6 +11164,7 @@
                 <w:color w:val="000000"/>
               </w:rPr>
             </w:pPr>
+            <w:proofErr w:type="spellStart"/>
             <w:r>
               <w:rPr>
                 <w:rFonts w:ascii="Arial" w:eastAsia="Calibri" w:hAnsi="Arial" w:cs="Arial"/>
@@ -10634,6 +11174,7 @@
               </w:rPr>
               <w:t>id_componente</w:t>
             </w:r>
+            <w:proofErr w:type="spellEnd"/>
           </w:p>
         </w:tc>
         <w:tc>
@@ -10653,6 +11194,7 @@
                 <w:color w:val="000000"/>
               </w:rPr>
             </w:pPr>
+            <w:proofErr w:type="spellStart"/>
             <w:r>
               <w:rPr>
                 <w:rFonts w:ascii="Arial" w:eastAsia="Calibri" w:hAnsi="Arial" w:cs="Arial"/>
@@ -10662,6 +11204,7 @@
               </w:rPr>
               <w:t>Integer</w:t>
             </w:r>
+            <w:proofErr w:type="spellEnd"/>
           </w:p>
         </w:tc>
         <w:tc>
@@ -10759,7 +11302,27 @@
           <w:iCs/>
           <w:color w:val="000000"/>
         </w:rPr>
-        <w:t>Relación Proveedor - Componente: Un proveedor puede proveer múltiples componentes de hardware (nuevos o usados/minería), pero cada componente registrado en el catálogo está asociado a un único proveedor principal (id_proveedor).</w:t>
+        <w:t>Relación Proveedor - Componente: Un proveedor puede proveer múltiples componentes de hardware (nuevos o usados/minería), pero cada componente registrado en el catálogo está asociado a un único proveedor principal (</w:t>
+      </w:r>
+      <w:proofErr w:type="spellStart"/>
+      <w:r>
+        <w:rPr>
+          <w:rFonts w:ascii="Arial" w:eastAsia="Calibri" w:hAnsi="Arial" w:cs="Arial"/>
+          <w:bCs/>
+          <w:iCs/>
+          <w:color w:val="000000"/>
+        </w:rPr>
+        <w:t>id_proveedor</w:t>
+      </w:r>
+      <w:proofErr w:type="spellEnd"/>
+      <w:r>
+        <w:rPr>
+          <w:rFonts w:ascii="Arial" w:eastAsia="Calibri" w:hAnsi="Arial" w:cs="Arial"/>
+          <w:bCs/>
+          <w:iCs/>
+          <w:color w:val="000000"/>
+        </w:rPr>
+        <w:t>).</w:t>
       </w:r>
     </w:p>
     <w:p>
@@ -10793,7 +11356,47 @@
           <w:iCs/>
           <w:color w:val="000000"/>
         </w:rPr>
-        <w:t>Relación Componente - MovimientoStock: Un componente de hardware puede tener múltiples movimientos de stock a lo largo del tiempo (ingresos por compras y egresos por ventas), pero cada movimiento registrado pertenece a un único componente específico (id_componente).</w:t>
+        <w:t xml:space="preserve">Relación Componente - </w:t>
+      </w:r>
+      <w:proofErr w:type="spellStart"/>
+      <w:r>
+        <w:rPr>
+          <w:rFonts w:ascii="Arial" w:eastAsia="Calibri" w:hAnsi="Arial" w:cs="Arial"/>
+          <w:bCs/>
+          <w:iCs/>
+          <w:color w:val="000000"/>
+        </w:rPr>
+        <w:t>MovimientoStock</w:t>
+      </w:r>
+      <w:proofErr w:type="spellEnd"/>
+      <w:r>
+        <w:rPr>
+          <w:rFonts w:ascii="Arial" w:eastAsia="Calibri" w:hAnsi="Arial" w:cs="Arial"/>
+          <w:bCs/>
+          <w:iCs/>
+          <w:color w:val="000000"/>
+        </w:rPr>
+        <w:t>: Un componente de hardware puede tener múltiples movimientos de stock a lo largo del tiempo (ingresos por compras y egresos por ventas), pero cada movimiento registrado pertenece a un único componente específico (</w:t>
+      </w:r>
+      <w:proofErr w:type="spellStart"/>
+      <w:r>
+        <w:rPr>
+          <w:rFonts w:ascii="Arial" w:eastAsia="Calibri" w:hAnsi="Arial" w:cs="Arial"/>
+          <w:bCs/>
+          <w:iCs/>
+          <w:color w:val="000000"/>
+        </w:rPr>
+        <w:t>id_componente</w:t>
+      </w:r>
+      <w:proofErr w:type="spellEnd"/>
+      <w:r>
+        <w:rPr>
+          <w:rFonts w:ascii="Arial" w:eastAsia="Calibri" w:hAnsi="Arial" w:cs="Arial"/>
+          <w:bCs/>
+          <w:iCs/>
+          <w:color w:val="000000"/>
+        </w:rPr>
+        <w:t>).</w:t>
       </w:r>
     </w:p>
     <w:p>
@@ -10832,7 +11435,7 @@
           <w:rFonts w:eastAsia="Calibri"/>
         </w:rPr>
       </w:pPr>
-      <w:bookmarkStart w:id="23" w:name="_Toc243164938"/>
+      <w:bookmarkStart w:id="23" w:name="_Toc243313151"/>
       <w:r>
         <w:rPr>
           <w:rFonts w:eastAsia="Calibri"/>
@@ -10912,7 +11515,27 @@
           <w:iCs/>
           <w:color w:val="000000"/>
         </w:rPr>
-        <w:t>Para mapear y diagramar el proceso organizativo que el software de inventario automatiza y transforma en Hardware &amp; Reco, se desarrolló el siguiente diagrama utilizando la notación estándar BPMN 2.0 en Bizagi Modeler.</w:t>
+        <w:t xml:space="preserve">Para mapear y diagramar el proceso organizativo que el software de inventario automatiza y transforma en Hardware &amp; Reco, se desarrolló el siguiente diagrama utilizando la notación estándar BPMN 2.0 en Bizagi </w:t>
+      </w:r>
+      <w:proofErr w:type="spellStart"/>
+      <w:r>
+        <w:rPr>
+          <w:rFonts w:ascii="Arial" w:eastAsia="Calibri" w:hAnsi="Arial" w:cs="Arial"/>
+          <w:bCs/>
+          <w:iCs/>
+          <w:color w:val="000000"/>
+        </w:rPr>
+        <w:t>Modeler</w:t>
+      </w:r>
+      <w:proofErr w:type="spellEnd"/>
+      <w:r>
+        <w:rPr>
+          <w:rFonts w:ascii="Arial" w:eastAsia="Calibri" w:hAnsi="Arial" w:cs="Arial"/>
+          <w:bCs/>
+          <w:iCs/>
+          <w:color w:val="000000"/>
+        </w:rPr>
+        <w:t>.</w:t>
       </w:r>
       <w:r>
         <w:rPr>
@@ -10989,7 +11612,7 @@
                     </pic:cNvPicPr>
                   </pic:nvPicPr>
                   <pic:blipFill>
-                    <a:blip r:embed="rId15" cstate="print">
+                    <a:blip r:embed="rId17" cstate="print">
                       <a:extLst>
                         <a:ext uri="{28A0092B-C50C-407E-A947-70E740481C1C}">
                           <a14:useLocalDpi xmlns:a14="http://schemas.microsoft.com/office/drawing/2010/main" val="0"/>
@@ -11023,6 +11646,23 @@
     </w:p>
     <w:p>
       <w:pPr>
+        <w:pStyle w:val="Ttulo2"/>
+        <w:rPr>
+          <w:rFonts w:eastAsia="Calibri"/>
+        </w:rPr>
+      </w:pPr>
+      <w:bookmarkStart w:id="24" w:name="_Toc243313152"/>
+      <w:r>
+        <w:rPr>
+          <w:rFonts w:eastAsia="Calibri"/>
+        </w:rPr>
+        <w:lastRenderedPageBreak/>
+        <w:t>Consigna 11</w:t>
+      </w:r>
+      <w:bookmarkEnd w:id="24"/>
+    </w:p>
+    <w:p>
+      <w:pPr>
         <w:keepNext/>
         <w:keepLines/>
         <w:pBdr>
@@ -11039,99 +11679,58 @@
           <w:bCs/>
           <w:iCs/>
           <w:color w:val="000000"/>
-        </w:rPr>
-      </w:pPr>
-      <w:r>
-        <w:rPr>
-          <w:rFonts w:ascii="Arial" w:eastAsia="Calibri" w:hAnsi="Arial" w:cs="Arial"/>
-          <w:bCs/>
-          <w:iCs/>
-          <w:color w:val="000000"/>
-        </w:rPr>
-        <w:lastRenderedPageBreak/>
-        <w:t>Declaración de transparencia: Se uso asistentes de IA (NotebookLM) con el propósito de estructurar</w:t>
-      </w:r>
-      <w:r>
-        <w:rPr>
-          <w:rFonts w:ascii="Arial" w:eastAsia="Calibri" w:hAnsi="Arial" w:cs="Arial"/>
-          <w:bCs/>
-          <w:iCs/>
-          <w:color w:val="000000"/>
-        </w:rPr>
-        <w:t xml:space="preserve"> (ósea, en como formar la plantilla del trabajo)</w:t>
-      </w:r>
-      <w:r>
-        <w:rPr>
-          <w:rFonts w:ascii="Arial" w:eastAsia="Calibri" w:hAnsi="Arial" w:cs="Arial"/>
-          <w:bCs/>
-          <w:iCs/>
-          <w:color w:val="000000"/>
-        </w:rPr>
-        <w:t xml:space="preserve"> los pasos del trabajo práctico</w:t>
-      </w:r>
-      <w:r>
-        <w:rPr>
-          <w:rFonts w:ascii="Arial" w:eastAsia="Calibri" w:hAnsi="Arial" w:cs="Arial"/>
-          <w:bCs/>
-          <w:iCs/>
-          <w:color w:val="000000"/>
+          <w:sz w:val="28"/>
+          <w:szCs w:val="28"/>
+        </w:rPr>
+      </w:pPr>
+      <w:r>
+        <w:rPr>
+          <w:rFonts w:ascii="Arial" w:eastAsia="Calibri" w:hAnsi="Arial" w:cs="Arial"/>
+          <w:bCs/>
+          <w:iCs/>
+          <w:color w:val="000000"/>
+          <w:sz w:val="28"/>
+          <w:szCs w:val="28"/>
+        </w:rPr>
+        <w:t xml:space="preserve">Gestión del Backlog Ágil con </w:t>
+      </w:r>
+      <w:proofErr w:type="spellStart"/>
+      <w:r>
+        <w:rPr>
+          <w:rFonts w:ascii="Arial" w:eastAsia="Calibri" w:hAnsi="Arial" w:cs="Arial"/>
+          <w:bCs/>
+          <w:iCs/>
+          <w:color w:val="000000"/>
+          <w:sz w:val="28"/>
+          <w:szCs w:val="28"/>
+        </w:rPr>
+        <w:t>Github</w:t>
+      </w:r>
+      <w:proofErr w:type="spellEnd"/>
+      <w:r>
+        <w:rPr>
+          <w:rFonts w:ascii="Arial" w:eastAsia="Calibri" w:hAnsi="Arial" w:cs="Arial"/>
+          <w:bCs/>
+          <w:iCs/>
+          <w:color w:val="000000"/>
+          <w:sz w:val="28"/>
+          <w:szCs w:val="28"/>
         </w:rPr>
         <w:t xml:space="preserve"> </w:t>
       </w:r>
-      <w:r>
-        <w:rPr>
-          <w:rFonts w:ascii="Arial" w:eastAsia="Calibri" w:hAnsi="Arial" w:cs="Arial"/>
-          <w:bCs/>
-          <w:iCs/>
-          <w:color w:val="000000"/>
-        </w:rPr>
-        <w:t xml:space="preserve">pero el contenido y las ideas, y la redacción están hechas por mí, </w:t>
-      </w:r>
-      <w:r>
-        <w:rPr>
-          <w:rFonts w:ascii="Arial" w:eastAsia="Calibri" w:hAnsi="Arial" w:cs="Arial"/>
-          <w:bCs/>
-          <w:iCs/>
-          <w:color w:val="000000"/>
-        </w:rPr>
-        <w:t xml:space="preserve">también me ayudaba si quería realizar una de las consignas en que </w:t>
-      </w:r>
-      <w:r>
-        <w:rPr>
-          <w:rFonts w:ascii="Arial" w:eastAsia="Calibri" w:hAnsi="Arial" w:cs="Arial"/>
-          <w:bCs/>
-          <w:iCs/>
-          <w:color w:val="000000"/>
-        </w:rPr>
-        <w:t>página</w:t>
-      </w:r>
-      <w:r>
-        <w:rPr>
-          <w:rFonts w:ascii="Arial" w:eastAsia="Calibri" w:hAnsi="Arial" w:cs="Arial"/>
-          <w:bCs/>
-          <w:iCs/>
-          <w:color w:val="000000"/>
-        </w:rPr>
-        <w:t xml:space="preserve"> y titulo buscar en los </w:t>
-      </w:r>
-      <w:r>
-        <w:rPr>
-          <w:rFonts w:ascii="Arial" w:eastAsia="Calibri" w:hAnsi="Arial" w:cs="Arial"/>
-          <w:bCs/>
-          <w:iCs/>
-          <w:color w:val="000000"/>
-        </w:rPr>
-        <w:t>PDF</w:t>
-      </w:r>
-      <w:r>
-        <w:rPr>
-          <w:rFonts w:ascii="Arial" w:eastAsia="Calibri" w:hAnsi="Arial" w:cs="Arial"/>
-          <w:bCs/>
-          <w:iCs/>
-          <w:color w:val="000000"/>
-        </w:rPr>
-        <w:t xml:space="preserve"> dicha información.</w:t>
-      </w:r>
+      <w:proofErr w:type="spellStart"/>
+      <w:r>
+        <w:rPr>
+          <w:rFonts w:ascii="Arial" w:eastAsia="Calibri" w:hAnsi="Arial" w:cs="Arial"/>
+          <w:bCs/>
+          <w:iCs/>
+          <w:color w:val="000000"/>
+          <w:sz w:val="28"/>
+          <w:szCs w:val="28"/>
+        </w:rPr>
+        <w:t>Projects</w:t>
+      </w:r>
+      <w:proofErr w:type="spellEnd"/>
     </w:p>
     <w:p>
       <w:pPr>
@@ -11158,45 +11757,57 @@
           <w:rFonts w:ascii="Arial" w:eastAsia="Calibri" w:hAnsi="Arial" w:cs="Arial"/>
           <w:bCs/>
           <w:iCs/>
-          <w:color w:val="000000"/>
-        </w:rPr>
-        <w:t xml:space="preserve">   En </w:t>
-      </w:r>
-      <w:r>
-        <w:rPr>
-          <w:rFonts w:ascii="Arial" w:eastAsia="Calibri" w:hAnsi="Arial" w:cs="Arial"/>
-          <w:bCs/>
-          <w:iCs/>
-          <w:color w:val="000000"/>
-        </w:rPr>
-        <w:t>la</w:t>
-      </w:r>
-      <w:r>
-        <w:rPr>
-          <w:rFonts w:ascii="Arial" w:eastAsia="Calibri" w:hAnsi="Arial" w:cs="Arial"/>
-          <w:bCs/>
-          <w:iCs/>
-          <w:color w:val="000000"/>
-        </w:rPr>
-        <w:t xml:space="preserve"> segunda entrega, primero hice las correcciones que me indicaron en la primera entrega con redacción propia. Y en esta segunda entrega en lo único que </w:t>
-      </w:r>
-      <w:r>
-        <w:rPr>
-          <w:rFonts w:ascii="Arial" w:eastAsia="Calibri" w:hAnsi="Arial" w:cs="Arial"/>
-          <w:bCs/>
-          <w:iCs/>
-          <w:color w:val="000000"/>
-        </w:rPr>
-        <w:t>utilice</w:t>
-      </w:r>
-      <w:r>
-        <w:rPr>
-          <w:rFonts w:ascii="Arial" w:eastAsia="Calibri" w:hAnsi="Arial" w:cs="Arial"/>
-          <w:bCs/>
-          <w:iCs/>
-          <w:color w:val="000000"/>
-        </w:rPr>
-        <w:t xml:space="preserve"> IA (NotebookLM) fue para que me ayude a encontrar ejemplos para establecer las metas de la consigna 2.</w:t>
+          <w:noProof/>
+          <w:color w:val="000000"/>
+        </w:rPr>
+        <w:drawing>
+          <wp:inline distT="0" distB="0" distL="0" distR="0" wp14:anchorId="749F2D28" wp14:editId="5B9B8A28">
+            <wp:extent cx="6228480" cy="2962656"/>
+            <wp:effectExtent l="0" t="0" r="1270" b="9525"/>
+            <wp:docPr id="414698712" name="Imagen 1"/>
+            <wp:cNvGraphicFramePr>
+              <a:graphicFrameLocks xmlns:a="http://schemas.openxmlformats.org/drawingml/2006/main" noChangeAspect="1"/>
+            </wp:cNvGraphicFramePr>
+            <a:graphic xmlns:a="http://schemas.openxmlformats.org/drawingml/2006/main">
+              <a:graphicData uri="http://schemas.openxmlformats.org/drawingml/2006/picture">
+                <pic:pic xmlns:pic="http://schemas.openxmlformats.org/drawingml/2006/picture">
+                  <pic:nvPicPr>
+                    <pic:cNvPr id="0" name="Picture 1"/>
+                    <pic:cNvPicPr>
+                      <a:picLocks noChangeAspect="1" noChangeArrowheads="1"/>
+                    </pic:cNvPicPr>
+                  </pic:nvPicPr>
+                  <pic:blipFill>
+                    <a:blip r:embed="rId18" cstate="print">
+                      <a:extLst>
+                        <a:ext uri="{28A0092B-C50C-407E-A947-70E740481C1C}">
+                          <a14:useLocalDpi xmlns:a14="http://schemas.microsoft.com/office/drawing/2010/main" val="0"/>
+                        </a:ext>
+                      </a:extLst>
+                    </a:blip>
+                    <a:srcRect/>
+                    <a:stretch>
+                      <a:fillRect/>
+                    </a:stretch>
+                  </pic:blipFill>
+                  <pic:spPr bwMode="auto">
+                    <a:xfrm>
+                      <a:off x="0" y="0"/>
+                      <a:ext cx="6240475" cy="2968362"/>
+                    </a:xfrm>
+                    <a:prstGeom prst="rect">
+                      <a:avLst/>
+                    </a:prstGeom>
+                    <a:noFill/>
+                    <a:ln>
+                      <a:noFill/>
+                    </a:ln>
+                  </pic:spPr>
+                </pic:pic>
+              </a:graphicData>
+            </a:graphic>
+          </wp:inline>
+        </w:drawing>
       </w:r>
     </w:p>
     <w:p>
@@ -11224,27 +11835,57 @@
           <w:rFonts w:ascii="Arial" w:eastAsia="Calibri" w:hAnsi="Arial" w:cs="Arial"/>
           <w:bCs/>
           <w:iCs/>
-          <w:color w:val="000000"/>
-        </w:rPr>
-        <w:t xml:space="preserve">  Para la tercera entrega, solamente utilicé IA para que me </w:t>
-      </w:r>
-      <w:r>
-        <w:rPr>
-          <w:rFonts w:ascii="Arial" w:eastAsia="Calibri" w:hAnsi="Arial" w:cs="Arial"/>
-          <w:bCs/>
-          <w:iCs/>
-          <w:color w:val="000000"/>
-        </w:rPr>
-        <w:t>dé</w:t>
-      </w:r>
-      <w:r>
-        <w:rPr>
-          <w:rFonts w:ascii="Arial" w:eastAsia="Calibri" w:hAnsi="Arial" w:cs="Arial"/>
-          <w:bCs/>
-          <w:iCs/>
-          <w:color w:val="000000"/>
-        </w:rPr>
-        <w:t xml:space="preserve"> ejemplos de diccionario de datos, también me guie por ejemplos de imágenes de Google. Y para el organigrama me guie por ejemplos de imágenes de Google y también por el PDF de la catedra.</w:t>
+          <w:noProof/>
+          <w:color w:val="000000"/>
+        </w:rPr>
+        <w:drawing>
+          <wp:inline distT="0" distB="0" distL="0" distR="0" wp14:anchorId="254D59F4" wp14:editId="3EDAE35B">
+            <wp:extent cx="6222507" cy="2889504"/>
+            <wp:effectExtent l="0" t="0" r="6985" b="6350"/>
+            <wp:docPr id="505998480" name="Imagen 2"/>
+            <wp:cNvGraphicFramePr>
+              <a:graphicFrameLocks xmlns:a="http://schemas.openxmlformats.org/drawingml/2006/main" noChangeAspect="1"/>
+            </wp:cNvGraphicFramePr>
+            <a:graphic xmlns:a="http://schemas.openxmlformats.org/drawingml/2006/main">
+              <a:graphicData uri="http://schemas.openxmlformats.org/drawingml/2006/picture">
+                <pic:pic xmlns:pic="http://schemas.openxmlformats.org/drawingml/2006/picture">
+                  <pic:nvPicPr>
+                    <pic:cNvPr id="0" name="Picture 2"/>
+                    <pic:cNvPicPr>
+                      <a:picLocks noChangeAspect="1" noChangeArrowheads="1"/>
+                    </pic:cNvPicPr>
+                  </pic:nvPicPr>
+                  <pic:blipFill>
+                    <a:blip r:embed="rId19">
+                      <a:extLst>
+                        <a:ext uri="{28A0092B-C50C-407E-A947-70E740481C1C}">
+                          <a14:useLocalDpi xmlns:a14="http://schemas.microsoft.com/office/drawing/2010/main" val="0"/>
+                        </a:ext>
+                      </a:extLst>
+                    </a:blip>
+                    <a:srcRect/>
+                    <a:stretch>
+                      <a:fillRect/>
+                    </a:stretch>
+                  </pic:blipFill>
+                  <pic:spPr bwMode="auto">
+                    <a:xfrm>
+                      <a:off x="0" y="0"/>
+                      <a:ext cx="6230581" cy="2893253"/>
+                    </a:xfrm>
+                    <a:prstGeom prst="rect">
+                      <a:avLst/>
+                    </a:prstGeom>
+                    <a:noFill/>
+                    <a:ln>
+                      <a:noFill/>
+                    </a:ln>
+                  </pic:spPr>
+                </pic:pic>
+              </a:graphicData>
+            </a:graphic>
+          </wp:inline>
+        </w:drawing>
       </w:r>
     </w:p>
     <w:p>
@@ -11272,9 +11913,58 @@
           <w:rFonts w:ascii="Arial" w:eastAsia="Calibri" w:hAnsi="Arial" w:cs="Arial"/>
           <w:bCs/>
           <w:iCs/>
-          <w:color w:val="000000"/>
-        </w:rPr>
-        <w:t xml:space="preserve">  Para la cuarta entrega, utilice Gemini para que me diga para que sirve cada elemento de un diagrama BPMN y me realice una tabla comparativa con ejemplos para cada uso.</w:t>
+          <w:noProof/>
+          <w:color w:val="000000"/>
+        </w:rPr>
+        <w:lastRenderedPageBreak/>
+        <w:drawing>
+          <wp:inline distT="0" distB="0" distL="0" distR="0" wp14:anchorId="36C799D1" wp14:editId="7F406778">
+            <wp:extent cx="6174029" cy="3082990"/>
+            <wp:effectExtent l="0" t="0" r="0" b="3175"/>
+            <wp:docPr id="1184332280" name="Imagen 3"/>
+            <wp:cNvGraphicFramePr>
+              <a:graphicFrameLocks xmlns:a="http://schemas.openxmlformats.org/drawingml/2006/main" noChangeAspect="1"/>
+            </wp:cNvGraphicFramePr>
+            <a:graphic xmlns:a="http://schemas.openxmlformats.org/drawingml/2006/main">
+              <a:graphicData uri="http://schemas.openxmlformats.org/drawingml/2006/picture">
+                <pic:pic xmlns:pic="http://schemas.openxmlformats.org/drawingml/2006/picture">
+                  <pic:nvPicPr>
+                    <pic:cNvPr id="0" name="Picture 3"/>
+                    <pic:cNvPicPr>
+                      <a:picLocks noChangeAspect="1" noChangeArrowheads="1"/>
+                    </pic:cNvPicPr>
+                  </pic:nvPicPr>
+                  <pic:blipFill>
+                    <a:blip r:embed="rId20">
+                      <a:extLst>
+                        <a:ext uri="{28A0092B-C50C-407E-A947-70E740481C1C}">
+                          <a14:useLocalDpi xmlns:a14="http://schemas.microsoft.com/office/drawing/2010/main" val="0"/>
+                        </a:ext>
+                      </a:extLst>
+                    </a:blip>
+                    <a:srcRect/>
+                    <a:stretch>
+                      <a:fillRect/>
+                    </a:stretch>
+                  </pic:blipFill>
+                  <pic:spPr bwMode="auto">
+                    <a:xfrm>
+                      <a:off x="0" y="0"/>
+                      <a:ext cx="6184762" cy="3088349"/>
+                    </a:xfrm>
+                    <a:prstGeom prst="rect">
+                      <a:avLst/>
+                    </a:prstGeom>
+                    <a:noFill/>
+                    <a:ln>
+                      <a:noFill/>
+                    </a:ln>
+                  </pic:spPr>
+                </pic:pic>
+              </a:graphicData>
+            </a:graphic>
+          </wp:inline>
+        </w:drawing>
       </w:r>
     </w:p>
     <w:p>
@@ -11297,6 +11987,63 @@
           <w:color w:val="000000"/>
         </w:rPr>
       </w:pPr>
+      <w:r>
+        <w:rPr>
+          <w:rFonts w:ascii="Arial" w:eastAsia="Calibri" w:hAnsi="Arial" w:cs="Arial"/>
+          <w:bCs/>
+          <w:iCs/>
+          <w:noProof/>
+          <w:color w:val="000000"/>
+        </w:rPr>
+        <w:drawing>
+          <wp:inline distT="0" distB="0" distL="0" distR="0" wp14:anchorId="50302CC2" wp14:editId="52341045">
+            <wp:extent cx="6181875" cy="3021177"/>
+            <wp:effectExtent l="0" t="0" r="0" b="8255"/>
+            <wp:docPr id="357770227" name="Imagen 4"/>
+            <wp:cNvGraphicFramePr>
+              <a:graphicFrameLocks xmlns:a="http://schemas.openxmlformats.org/drawingml/2006/main" noChangeAspect="1"/>
+            </wp:cNvGraphicFramePr>
+            <a:graphic xmlns:a="http://schemas.openxmlformats.org/drawingml/2006/main">
+              <a:graphicData uri="http://schemas.openxmlformats.org/drawingml/2006/picture">
+                <pic:pic xmlns:pic="http://schemas.openxmlformats.org/drawingml/2006/picture">
+                  <pic:nvPicPr>
+                    <pic:cNvPr id="0" name="Picture 4"/>
+                    <pic:cNvPicPr>
+                      <a:picLocks noChangeAspect="1" noChangeArrowheads="1"/>
+                    </pic:cNvPicPr>
+                  </pic:nvPicPr>
+                  <pic:blipFill>
+                    <a:blip r:embed="rId21">
+                      <a:extLst>
+                        <a:ext uri="{28A0092B-C50C-407E-A947-70E740481C1C}">
+                          <a14:useLocalDpi xmlns:a14="http://schemas.microsoft.com/office/drawing/2010/main" val="0"/>
+                        </a:ext>
+                      </a:extLst>
+                    </a:blip>
+                    <a:srcRect/>
+                    <a:stretch>
+                      <a:fillRect/>
+                    </a:stretch>
+                  </pic:blipFill>
+                  <pic:spPr bwMode="auto">
+                    <a:xfrm>
+                      <a:off x="0" y="0"/>
+                      <a:ext cx="6189860" cy="3025080"/>
+                    </a:xfrm>
+                    <a:prstGeom prst="rect">
+                      <a:avLst/>
+                    </a:prstGeom>
+                    <a:noFill/>
+                    <a:ln>
+                      <a:noFill/>
+                    </a:ln>
+                  </pic:spPr>
+                </pic:pic>
+              </a:graphicData>
+            </a:graphic>
+          </wp:inline>
+        </w:drawing>
+      </w:r>
     </w:p>
     <w:p>
       <w:pPr>
@@ -11321,21 +12068,889 @@
     </w:p>
     <w:p>
       <w:pPr>
+        <w:keepNext/>
+        <w:keepLines/>
+        <w:pBdr>
+          <w:top w:val="nil"/>
+          <w:left w:val="nil"/>
+          <w:bottom w:val="nil"/>
+          <w:right w:val="nil"/>
+          <w:between w:val="nil"/>
+        </w:pBdr>
+        <w:spacing w:before="200" w:after="120"/>
+        <w:ind w:firstLine="0"/>
+        <w:rPr>
+          <w:rFonts w:ascii="Arial" w:eastAsia="Calibri" w:hAnsi="Arial" w:cs="Arial"/>
+          <w:bCs/>
+          <w:iCs/>
+          <w:color w:val="000000"/>
+        </w:rPr>
+      </w:pPr>
+    </w:p>
+    <w:p>
+      <w:pPr>
+        <w:keepNext/>
+        <w:keepLines/>
+        <w:pBdr>
+          <w:top w:val="nil"/>
+          <w:left w:val="nil"/>
+          <w:bottom w:val="nil"/>
+          <w:right w:val="nil"/>
+          <w:between w:val="nil"/>
+        </w:pBdr>
+        <w:spacing w:before="200" w:after="120"/>
+        <w:ind w:firstLine="0"/>
+        <w:rPr>
+          <w:rFonts w:ascii="Arial" w:eastAsia="Calibri" w:hAnsi="Arial" w:cs="Arial"/>
+          <w:bCs/>
+          <w:iCs/>
+          <w:color w:val="000000"/>
+        </w:rPr>
+      </w:pPr>
+    </w:p>
+    <w:p>
+      <w:pPr>
+        <w:keepNext/>
+        <w:keepLines/>
+        <w:pBdr>
+          <w:top w:val="nil"/>
+          <w:left w:val="nil"/>
+          <w:bottom w:val="nil"/>
+          <w:right w:val="nil"/>
+          <w:between w:val="nil"/>
+        </w:pBdr>
+        <w:spacing w:before="200" w:after="120"/>
+        <w:ind w:firstLine="0"/>
+        <w:rPr>
+          <w:rFonts w:ascii="Arial" w:eastAsia="Calibri" w:hAnsi="Arial" w:cs="Arial"/>
+          <w:bCs/>
+          <w:iCs/>
+          <w:color w:val="000000"/>
+        </w:rPr>
+      </w:pPr>
+    </w:p>
+    <w:p>
+      <w:pPr>
+        <w:keepNext/>
+        <w:keepLines/>
+        <w:pBdr>
+          <w:top w:val="nil"/>
+          <w:left w:val="nil"/>
+          <w:bottom w:val="nil"/>
+          <w:right w:val="nil"/>
+          <w:between w:val="nil"/>
+        </w:pBdr>
+        <w:spacing w:before="200" w:after="120"/>
+        <w:ind w:firstLine="0"/>
+        <w:rPr>
+          <w:rFonts w:ascii="Arial" w:eastAsia="Calibri" w:hAnsi="Arial" w:cs="Arial"/>
+          <w:bCs/>
+          <w:iCs/>
+          <w:color w:val="000000"/>
+        </w:rPr>
+      </w:pPr>
+    </w:p>
+    <w:p>
+      <w:pPr>
+        <w:pStyle w:val="Ttulo2"/>
+        <w:rPr>
+          <w:rFonts w:eastAsia="Calibri"/>
+        </w:rPr>
+      </w:pPr>
+      <w:bookmarkStart w:id="25" w:name="_Toc243313153"/>
+      <w:r>
+        <w:rPr>
+          <w:rFonts w:eastAsia="Calibri"/>
+        </w:rPr>
+        <w:lastRenderedPageBreak/>
+        <w:t>Consigna 12</w:t>
+      </w:r>
+      <w:bookmarkEnd w:id="25"/>
+    </w:p>
+    <w:p>
+      <w:pPr>
+        <w:keepNext/>
+        <w:keepLines/>
+        <w:pBdr>
+          <w:top w:val="nil"/>
+          <w:left w:val="nil"/>
+          <w:bottom w:val="nil"/>
+          <w:right w:val="nil"/>
+          <w:between w:val="nil"/>
+        </w:pBdr>
+        <w:spacing w:before="200" w:after="120"/>
+        <w:ind w:firstLine="0"/>
+        <w:rPr>
+          <w:rFonts w:ascii="Arial" w:eastAsia="Calibri" w:hAnsi="Arial" w:cs="Arial"/>
+          <w:bCs/>
+          <w:iCs/>
+          <w:color w:val="000000"/>
+          <w:sz w:val="28"/>
+          <w:szCs w:val="28"/>
+        </w:rPr>
+      </w:pPr>
+      <w:r>
+        <w:rPr>
+          <w:rFonts w:ascii="Arial" w:eastAsia="Calibri" w:hAnsi="Arial" w:cs="Arial"/>
+          <w:bCs/>
+          <w:iCs/>
+          <w:color w:val="000000"/>
+          <w:sz w:val="28"/>
+          <w:szCs w:val="28"/>
+        </w:rPr>
+        <w:t>Mecanismos de Control y Estándares de Desempeño</w:t>
+      </w:r>
+    </w:p>
+    <w:p>
+      <w:pPr>
+        <w:keepNext/>
+        <w:keepLines/>
+        <w:pBdr>
+          <w:top w:val="nil"/>
+          <w:left w:val="nil"/>
+          <w:bottom w:val="nil"/>
+          <w:right w:val="nil"/>
+          <w:between w:val="nil"/>
+        </w:pBdr>
+        <w:spacing w:before="200" w:after="120"/>
+        <w:ind w:firstLine="0"/>
+        <w:rPr>
+          <w:rFonts w:ascii="Arial" w:eastAsia="Calibri" w:hAnsi="Arial" w:cs="Arial"/>
+          <w:bCs/>
+          <w:iCs/>
+          <w:color w:val="000000"/>
+        </w:rPr>
+      </w:pPr>
+      <w:r>
+        <w:rPr>
+          <w:rFonts w:ascii="Arial" w:eastAsia="Calibri" w:hAnsi="Arial" w:cs="Arial"/>
+          <w:bCs/>
+          <w:iCs/>
+          <w:color w:val="000000"/>
+        </w:rPr>
+        <w:t xml:space="preserve">    </w:t>
+      </w:r>
+      <w:r>
+        <w:rPr>
+          <w:rFonts w:ascii="Arial" w:eastAsia="Calibri" w:hAnsi="Arial" w:cs="Arial"/>
+          <w:bCs/>
+          <w:iCs/>
+          <w:color w:val="000000"/>
+        </w:rPr>
+        <w:t xml:space="preserve">Para garantizar la auditoría técnica y la calidad operativa del sistema de inventario automatizado en </w:t>
+      </w:r>
+      <w:r>
+        <w:rPr>
+          <w:rFonts w:ascii="Arial" w:eastAsia="Calibri" w:hAnsi="Arial" w:cs="Arial"/>
+          <w:bCs/>
+          <w:i/>
+          <w:iCs/>
+          <w:color w:val="000000"/>
+        </w:rPr>
+        <w:t>Hardware &amp; Reco</w:t>
+      </w:r>
+      <w:r>
+        <w:rPr>
+          <w:rFonts w:ascii="Arial" w:eastAsia="Calibri" w:hAnsi="Arial" w:cs="Arial"/>
+          <w:bCs/>
+          <w:iCs/>
+          <w:color w:val="000000"/>
+        </w:rPr>
+        <w:t>, se establecen los siguientes indicadores de control:</w:t>
+      </w:r>
+    </w:p>
+    <w:p>
+      <w:pPr>
+        <w:pStyle w:val="Prrafodelista"/>
+        <w:keepNext/>
+        <w:keepLines/>
+        <w:numPr>
+          <w:ilvl w:val="0"/>
+          <w:numId w:val="31"/>
+        </w:numPr>
+        <w:pBdr>
+          <w:top w:val="nil"/>
+          <w:left w:val="nil"/>
+          <w:bottom w:val="nil"/>
+          <w:right w:val="nil"/>
+          <w:between w:val="nil"/>
+        </w:pBdr>
+        <w:spacing w:before="200" w:after="120"/>
+        <w:rPr>
+          <w:rFonts w:ascii="Arial" w:eastAsia="Calibri" w:hAnsi="Arial" w:cs="Arial"/>
+          <w:bCs/>
+          <w:iCs/>
+          <w:color w:val="000000"/>
+        </w:rPr>
+      </w:pPr>
+      <w:r>
+        <w:rPr>
+          <w:rFonts w:ascii="Arial" w:eastAsia="Calibri" w:hAnsi="Arial" w:cs="Arial"/>
+          <w:b/>
+          <w:bCs/>
+          <w:iCs/>
+          <w:color w:val="000000"/>
+        </w:rPr>
+        <w:t>Sincronización de Inventario y Precios:</w:t>
+      </w:r>
+      <w:r>
+        <w:rPr>
+          <w:rFonts w:ascii="Arial" w:eastAsia="Calibri" w:hAnsi="Arial" w:cs="Arial"/>
+          <w:bCs/>
+          <w:iCs/>
+          <w:color w:val="000000"/>
+        </w:rPr>
+        <w:t xml:space="preserve"> 0% de desfase temporal entre las transacciones de la tienda física, el e-</w:t>
+      </w:r>
+      <w:proofErr w:type="spellStart"/>
+      <w:r>
+        <w:rPr>
+          <w:rFonts w:ascii="Arial" w:eastAsia="Calibri" w:hAnsi="Arial" w:cs="Arial"/>
+          <w:bCs/>
+          <w:iCs/>
+          <w:color w:val="000000"/>
+        </w:rPr>
+        <w:t>commerce</w:t>
+      </w:r>
+      <w:proofErr w:type="spellEnd"/>
+      <w:r>
+        <w:rPr>
+          <w:rFonts w:ascii="Arial" w:eastAsia="Calibri" w:hAnsi="Arial" w:cs="Arial"/>
+          <w:bCs/>
+          <w:iCs/>
+          <w:color w:val="000000"/>
+        </w:rPr>
+        <w:t xml:space="preserve"> y los reportes contables del área de Finanzas.</w:t>
+      </w:r>
+    </w:p>
+    <w:p>
+      <w:pPr>
+        <w:pStyle w:val="Prrafodelista"/>
+        <w:keepNext/>
+        <w:keepLines/>
+        <w:numPr>
+          <w:ilvl w:val="0"/>
+          <w:numId w:val="31"/>
+        </w:numPr>
+        <w:pBdr>
+          <w:top w:val="nil"/>
+          <w:left w:val="nil"/>
+          <w:bottom w:val="nil"/>
+          <w:right w:val="nil"/>
+          <w:between w:val="nil"/>
+        </w:pBdr>
+        <w:spacing w:before="200" w:after="120"/>
+        <w:rPr>
+          <w:rFonts w:ascii="Arial" w:eastAsia="Calibri" w:hAnsi="Arial" w:cs="Arial"/>
+          <w:bCs/>
+          <w:iCs/>
+          <w:color w:val="000000"/>
+        </w:rPr>
+      </w:pPr>
+      <w:r>
+        <w:rPr>
+          <w:rFonts w:ascii="Arial" w:eastAsia="Calibri" w:hAnsi="Arial" w:cs="Arial"/>
+          <w:b/>
+          <w:bCs/>
+          <w:iCs/>
+          <w:color w:val="000000"/>
+        </w:rPr>
+        <w:t>Rendimiento de Consultas:</w:t>
+      </w:r>
+      <w:r>
+        <w:rPr>
+          <w:rFonts w:ascii="Arial" w:eastAsia="Calibri" w:hAnsi="Arial" w:cs="Arial"/>
+          <w:bCs/>
+          <w:iCs/>
+          <w:color w:val="000000"/>
+        </w:rPr>
+        <w:t xml:space="preserve"> Tiempo de respuesta del servidor inferior a 1.5 segundos en la verificación de disponibilidad de componentes para asegurar una óptima experiencia de usuario.</w:t>
+      </w:r>
+    </w:p>
+    <w:p>
+      <w:pPr>
+        <w:pStyle w:val="Prrafodelista"/>
+        <w:keepNext/>
+        <w:keepLines/>
+        <w:numPr>
+          <w:ilvl w:val="0"/>
+          <w:numId w:val="31"/>
+        </w:numPr>
+        <w:pBdr>
+          <w:top w:val="nil"/>
+          <w:left w:val="nil"/>
+          <w:bottom w:val="nil"/>
+          <w:right w:val="nil"/>
+          <w:between w:val="nil"/>
+        </w:pBdr>
+        <w:spacing w:before="200" w:after="120"/>
+        <w:rPr>
+          <w:rFonts w:ascii="Arial" w:eastAsia="Calibri" w:hAnsi="Arial" w:cs="Arial"/>
+          <w:bCs/>
+          <w:iCs/>
+          <w:color w:val="000000"/>
+        </w:rPr>
+      </w:pPr>
+      <w:r>
+        <w:rPr>
+          <w:rFonts w:ascii="Arial" w:eastAsia="Calibri" w:hAnsi="Arial" w:cs="Arial"/>
+          <w:b/>
+          <w:bCs/>
+          <w:iCs/>
+          <w:color w:val="000000"/>
+        </w:rPr>
+        <w:t>Escalabilidad y Carga:</w:t>
+      </w:r>
+      <w:r>
+        <w:rPr>
+          <w:rFonts w:ascii="Arial" w:eastAsia="Calibri" w:hAnsi="Arial" w:cs="Arial"/>
+          <w:bCs/>
+          <w:iCs/>
+          <w:color w:val="000000"/>
+        </w:rPr>
+        <w:t xml:space="preserve"> Capacidad del sistema para soportar el registro de hasta 15.000 componentes de hardware y 5.000 transacciones mensuales simultáneas.</w:t>
+      </w:r>
+    </w:p>
+    <w:p>
+      <w:pPr>
+        <w:pStyle w:val="Prrafodelista"/>
+        <w:keepNext/>
+        <w:keepLines/>
+        <w:numPr>
+          <w:ilvl w:val="0"/>
+          <w:numId w:val="31"/>
+        </w:numPr>
+        <w:pBdr>
+          <w:top w:val="nil"/>
+          <w:left w:val="nil"/>
+          <w:bottom w:val="nil"/>
+          <w:right w:val="nil"/>
+          <w:between w:val="nil"/>
+        </w:pBdr>
+        <w:spacing w:before="200" w:after="120"/>
+        <w:rPr>
+          <w:rFonts w:ascii="Arial" w:eastAsia="Calibri" w:hAnsi="Arial" w:cs="Arial"/>
+          <w:bCs/>
+          <w:iCs/>
+          <w:color w:val="000000"/>
+        </w:rPr>
+      </w:pPr>
+      <w:r>
+        <w:rPr>
+          <w:rFonts w:ascii="Arial" w:eastAsia="Calibri" w:hAnsi="Arial" w:cs="Arial"/>
+          <w:b/>
+          <w:bCs/>
+          <w:iCs/>
+          <w:color w:val="000000"/>
+        </w:rPr>
+        <w:t>Disponibilidad y Tolerancia a Fallos:</w:t>
+      </w:r>
+      <w:r>
+        <w:rPr>
+          <w:rFonts w:ascii="Arial" w:eastAsia="Calibri" w:hAnsi="Arial" w:cs="Arial"/>
+          <w:bCs/>
+          <w:iCs/>
+          <w:color w:val="000000"/>
+        </w:rPr>
+        <w:t xml:space="preserve"> Utilización de servidores redundantes (principal y secundario) para asegurar la continuidad operativa de la plataforma web frente a cortes o fallas imprevistas.</w:t>
+      </w:r>
+    </w:p>
+    <w:p>
+      <w:pPr>
+        <w:keepNext/>
+        <w:keepLines/>
+        <w:pBdr>
+          <w:top w:val="nil"/>
+          <w:left w:val="nil"/>
+          <w:bottom w:val="nil"/>
+          <w:right w:val="nil"/>
+          <w:between w:val="nil"/>
+        </w:pBdr>
+        <w:spacing w:before="200" w:after="120"/>
+        <w:ind w:firstLine="0"/>
+        <w:rPr>
+          <w:rFonts w:ascii="Arial" w:eastAsia="Calibri" w:hAnsi="Arial" w:cs="Arial"/>
+          <w:bCs/>
+          <w:iCs/>
+          <w:color w:val="000000"/>
+        </w:rPr>
+      </w:pPr>
+    </w:p>
+    <w:p>
+      <w:pPr>
+        <w:keepNext/>
+        <w:keepLines/>
+        <w:pBdr>
+          <w:top w:val="nil"/>
+          <w:left w:val="nil"/>
+          <w:bottom w:val="nil"/>
+          <w:right w:val="nil"/>
+          <w:between w:val="nil"/>
+        </w:pBdr>
+        <w:spacing w:before="200" w:after="120"/>
+        <w:ind w:firstLine="0"/>
+        <w:rPr>
+          <w:rFonts w:ascii="Arial" w:eastAsia="Calibri" w:hAnsi="Arial" w:cs="Arial"/>
+          <w:bCs/>
+          <w:iCs/>
+          <w:color w:val="000000"/>
+          <w:sz w:val="28"/>
+          <w:szCs w:val="28"/>
+        </w:rPr>
+      </w:pPr>
+      <w:r>
+        <w:rPr>
+          <w:rFonts w:ascii="Arial" w:eastAsia="Calibri" w:hAnsi="Arial" w:cs="Arial"/>
+          <w:bCs/>
+          <w:iCs/>
+          <w:color w:val="000000"/>
+          <w:sz w:val="28"/>
+          <w:szCs w:val="28"/>
+        </w:rPr>
+        <w:t xml:space="preserve">Declaración de transparencia: </w:t>
+      </w:r>
+    </w:p>
+    <w:p>
+      <w:pPr>
+        <w:keepNext/>
+        <w:keepLines/>
+        <w:pBdr>
+          <w:top w:val="nil"/>
+          <w:left w:val="nil"/>
+          <w:bottom w:val="nil"/>
+          <w:right w:val="nil"/>
+          <w:between w:val="nil"/>
+        </w:pBdr>
+        <w:spacing w:before="200" w:after="120"/>
+        <w:ind w:firstLine="0"/>
+        <w:rPr>
+          <w:rFonts w:ascii="Arial" w:eastAsia="Calibri" w:hAnsi="Arial" w:cs="Arial"/>
+          <w:bCs/>
+          <w:iCs/>
+          <w:color w:val="000000"/>
+        </w:rPr>
+      </w:pPr>
+      <w:r>
+        <w:rPr>
+          <w:rFonts w:ascii="Arial" w:eastAsia="Calibri" w:hAnsi="Arial" w:cs="Arial"/>
+          <w:bCs/>
+          <w:iCs/>
+          <w:color w:val="000000"/>
+        </w:rPr>
+        <w:t xml:space="preserve">    </w:t>
+      </w:r>
+      <w:r>
+        <w:rPr>
+          <w:rFonts w:ascii="Arial" w:eastAsia="Calibri" w:hAnsi="Arial" w:cs="Arial"/>
+          <w:bCs/>
+          <w:iCs/>
+          <w:color w:val="000000"/>
+        </w:rPr>
+        <w:t>Se uso asistentes de IA (</w:t>
+      </w:r>
+      <w:proofErr w:type="spellStart"/>
+      <w:r>
+        <w:rPr>
+          <w:rFonts w:ascii="Arial" w:eastAsia="Calibri" w:hAnsi="Arial" w:cs="Arial"/>
+          <w:bCs/>
+          <w:iCs/>
+          <w:color w:val="000000"/>
+        </w:rPr>
+        <w:t>NotebookLM</w:t>
+      </w:r>
+      <w:proofErr w:type="spellEnd"/>
+      <w:r>
+        <w:rPr>
+          <w:rFonts w:ascii="Arial" w:eastAsia="Calibri" w:hAnsi="Arial" w:cs="Arial"/>
+          <w:bCs/>
+          <w:iCs/>
+          <w:color w:val="000000"/>
+        </w:rPr>
+        <w:t>) con el propósito de estructurar</w:t>
+      </w:r>
+      <w:r>
+        <w:rPr>
+          <w:rFonts w:ascii="Arial" w:eastAsia="Calibri" w:hAnsi="Arial" w:cs="Arial"/>
+          <w:bCs/>
+          <w:iCs/>
+          <w:color w:val="000000"/>
+        </w:rPr>
+        <w:t xml:space="preserve"> (ósea, en como formar la plantilla del trabajo)</w:t>
+      </w:r>
+      <w:r>
+        <w:rPr>
+          <w:rFonts w:ascii="Arial" w:eastAsia="Calibri" w:hAnsi="Arial" w:cs="Arial"/>
+          <w:bCs/>
+          <w:iCs/>
+          <w:color w:val="000000"/>
+        </w:rPr>
+        <w:t xml:space="preserve"> los pasos del trabajo práctico</w:t>
+      </w:r>
+      <w:r>
+        <w:rPr>
+          <w:rFonts w:ascii="Arial" w:eastAsia="Calibri" w:hAnsi="Arial" w:cs="Arial"/>
+          <w:bCs/>
+          <w:iCs/>
+          <w:color w:val="000000"/>
+        </w:rPr>
+        <w:t xml:space="preserve"> </w:t>
+      </w:r>
+      <w:r>
+        <w:rPr>
+          <w:rFonts w:ascii="Arial" w:eastAsia="Calibri" w:hAnsi="Arial" w:cs="Arial"/>
+          <w:bCs/>
+          <w:iCs/>
+          <w:color w:val="000000"/>
+        </w:rPr>
+        <w:t xml:space="preserve">pero el contenido y las ideas, y la redacción están hechas por mí, </w:t>
+      </w:r>
+      <w:r>
+        <w:rPr>
+          <w:rFonts w:ascii="Arial" w:eastAsia="Calibri" w:hAnsi="Arial" w:cs="Arial"/>
+          <w:bCs/>
+          <w:iCs/>
+          <w:color w:val="000000"/>
+        </w:rPr>
+        <w:t xml:space="preserve">también me ayudaba si quería realizar una de las consignas en que </w:t>
+      </w:r>
+      <w:r>
+        <w:rPr>
+          <w:rFonts w:ascii="Arial" w:eastAsia="Calibri" w:hAnsi="Arial" w:cs="Arial"/>
+          <w:bCs/>
+          <w:iCs/>
+          <w:color w:val="000000"/>
+        </w:rPr>
+        <w:t>página</w:t>
+      </w:r>
+      <w:r>
+        <w:rPr>
+          <w:rFonts w:ascii="Arial" w:eastAsia="Calibri" w:hAnsi="Arial" w:cs="Arial"/>
+          <w:bCs/>
+          <w:iCs/>
+          <w:color w:val="000000"/>
+        </w:rPr>
+        <w:t xml:space="preserve"> y titulo buscar en los </w:t>
+      </w:r>
+      <w:r>
+        <w:rPr>
+          <w:rFonts w:ascii="Arial" w:eastAsia="Calibri" w:hAnsi="Arial" w:cs="Arial"/>
+          <w:bCs/>
+          <w:iCs/>
+          <w:color w:val="000000"/>
+        </w:rPr>
+        <w:t>PDF</w:t>
+      </w:r>
+      <w:r>
+        <w:rPr>
+          <w:rFonts w:ascii="Arial" w:eastAsia="Calibri" w:hAnsi="Arial" w:cs="Arial"/>
+          <w:bCs/>
+          <w:iCs/>
+          <w:color w:val="000000"/>
+        </w:rPr>
+        <w:t xml:space="preserve"> dicha información.</w:t>
+      </w:r>
+    </w:p>
+    <w:p>
+      <w:pPr>
+        <w:keepNext/>
+        <w:keepLines/>
+        <w:pBdr>
+          <w:top w:val="nil"/>
+          <w:left w:val="nil"/>
+          <w:bottom w:val="nil"/>
+          <w:right w:val="nil"/>
+          <w:between w:val="nil"/>
+        </w:pBdr>
+        <w:spacing w:before="200" w:after="120"/>
+        <w:ind w:firstLine="0"/>
+        <w:rPr>
+          <w:rFonts w:ascii="Arial" w:eastAsia="Calibri" w:hAnsi="Arial" w:cs="Arial"/>
+          <w:bCs/>
+          <w:iCs/>
+          <w:color w:val="000000"/>
+        </w:rPr>
+      </w:pPr>
+      <w:r>
+        <w:rPr>
+          <w:rFonts w:ascii="Arial" w:eastAsia="Calibri" w:hAnsi="Arial" w:cs="Arial"/>
+          <w:bCs/>
+          <w:iCs/>
+          <w:color w:val="000000"/>
+        </w:rPr>
+        <w:t xml:space="preserve">   En </w:t>
+      </w:r>
+      <w:r>
+        <w:rPr>
+          <w:rFonts w:ascii="Arial" w:eastAsia="Calibri" w:hAnsi="Arial" w:cs="Arial"/>
+          <w:bCs/>
+          <w:iCs/>
+          <w:color w:val="000000"/>
+        </w:rPr>
+        <w:t>la</w:t>
+      </w:r>
+      <w:r>
+        <w:rPr>
+          <w:rFonts w:ascii="Arial" w:eastAsia="Calibri" w:hAnsi="Arial" w:cs="Arial"/>
+          <w:bCs/>
+          <w:iCs/>
+          <w:color w:val="000000"/>
+        </w:rPr>
+        <w:t xml:space="preserve"> segunda entrega, primero hice las correcciones que me indicaron en la primera entrega con redacción propia. Y en esta segunda entrega en lo único que </w:t>
+      </w:r>
+      <w:r>
+        <w:rPr>
+          <w:rFonts w:ascii="Arial" w:eastAsia="Calibri" w:hAnsi="Arial" w:cs="Arial"/>
+          <w:bCs/>
+          <w:iCs/>
+          <w:color w:val="000000"/>
+        </w:rPr>
+        <w:t>utilice</w:t>
+      </w:r>
+      <w:r>
+        <w:rPr>
+          <w:rFonts w:ascii="Arial" w:eastAsia="Calibri" w:hAnsi="Arial" w:cs="Arial"/>
+          <w:bCs/>
+          <w:iCs/>
+          <w:color w:val="000000"/>
+        </w:rPr>
+        <w:t xml:space="preserve"> IA (</w:t>
+      </w:r>
+      <w:proofErr w:type="spellStart"/>
+      <w:r>
+        <w:rPr>
+          <w:rFonts w:ascii="Arial" w:eastAsia="Calibri" w:hAnsi="Arial" w:cs="Arial"/>
+          <w:bCs/>
+          <w:iCs/>
+          <w:color w:val="000000"/>
+        </w:rPr>
+        <w:t>NotebookLM</w:t>
+      </w:r>
+      <w:proofErr w:type="spellEnd"/>
+      <w:r>
+        <w:rPr>
+          <w:rFonts w:ascii="Arial" w:eastAsia="Calibri" w:hAnsi="Arial" w:cs="Arial"/>
+          <w:bCs/>
+          <w:iCs/>
+          <w:color w:val="000000"/>
+        </w:rPr>
+        <w:t>) fue para que me ayude a encontrar ejemplos para establecer las metas de la consigna 2.</w:t>
+      </w:r>
+    </w:p>
+    <w:p>
+      <w:pPr>
+        <w:keepNext/>
+        <w:keepLines/>
+        <w:pBdr>
+          <w:top w:val="nil"/>
+          <w:left w:val="nil"/>
+          <w:bottom w:val="nil"/>
+          <w:right w:val="nil"/>
+          <w:between w:val="nil"/>
+        </w:pBdr>
+        <w:spacing w:before="200" w:after="120"/>
+        <w:ind w:firstLine="0"/>
+        <w:rPr>
+          <w:rFonts w:ascii="Arial" w:eastAsia="Calibri" w:hAnsi="Arial" w:cs="Arial"/>
+          <w:bCs/>
+          <w:iCs/>
+          <w:color w:val="000000"/>
+        </w:rPr>
+      </w:pPr>
+      <w:r>
+        <w:rPr>
+          <w:rFonts w:ascii="Arial" w:eastAsia="Calibri" w:hAnsi="Arial" w:cs="Arial"/>
+          <w:bCs/>
+          <w:iCs/>
+          <w:color w:val="000000"/>
+        </w:rPr>
+        <w:t xml:space="preserve">  </w:t>
+      </w:r>
+      <w:r>
+        <w:rPr>
+          <w:rFonts w:ascii="Arial" w:eastAsia="Calibri" w:hAnsi="Arial" w:cs="Arial"/>
+          <w:bCs/>
+          <w:iCs/>
+          <w:color w:val="000000"/>
+        </w:rPr>
+        <w:t xml:space="preserve"> </w:t>
+      </w:r>
+      <w:r>
+        <w:rPr>
+          <w:rFonts w:ascii="Arial" w:eastAsia="Calibri" w:hAnsi="Arial" w:cs="Arial"/>
+          <w:bCs/>
+          <w:iCs/>
+          <w:color w:val="000000"/>
+        </w:rPr>
+        <w:t xml:space="preserve">Para la tercera entrega, solamente utilicé IA para que me </w:t>
+      </w:r>
+      <w:r>
+        <w:rPr>
+          <w:rFonts w:ascii="Arial" w:eastAsia="Calibri" w:hAnsi="Arial" w:cs="Arial"/>
+          <w:bCs/>
+          <w:iCs/>
+          <w:color w:val="000000"/>
+        </w:rPr>
+        <w:t>dé</w:t>
+      </w:r>
+      <w:r>
+        <w:rPr>
+          <w:rFonts w:ascii="Arial" w:eastAsia="Calibri" w:hAnsi="Arial" w:cs="Arial"/>
+          <w:bCs/>
+          <w:iCs/>
+          <w:color w:val="000000"/>
+        </w:rPr>
+        <w:t xml:space="preserve"> ejemplos de diccionario de datos, también me guie por ejemplos de imágenes de Google. Y para el organigrama me guie por ejemplos de imágenes de Google y también por el PDF de la catedra.</w:t>
+      </w:r>
+    </w:p>
+    <w:p>
+      <w:pPr>
+        <w:keepNext/>
+        <w:keepLines/>
+        <w:pBdr>
+          <w:top w:val="nil"/>
+          <w:left w:val="nil"/>
+          <w:bottom w:val="nil"/>
+          <w:right w:val="nil"/>
+          <w:between w:val="nil"/>
+        </w:pBdr>
+        <w:spacing w:before="200" w:after="120"/>
+        <w:ind w:firstLine="0"/>
+        <w:rPr>
+          <w:rFonts w:ascii="Arial" w:eastAsia="Calibri" w:hAnsi="Arial" w:cs="Arial"/>
+          <w:bCs/>
+          <w:iCs/>
+          <w:color w:val="000000"/>
+        </w:rPr>
+      </w:pPr>
+      <w:r>
+        <w:rPr>
+          <w:rFonts w:ascii="Arial" w:eastAsia="Calibri" w:hAnsi="Arial" w:cs="Arial"/>
+          <w:bCs/>
+          <w:iCs/>
+          <w:color w:val="000000"/>
+        </w:rPr>
+        <w:t xml:space="preserve">  </w:t>
+      </w:r>
+      <w:r>
+        <w:rPr>
+          <w:rFonts w:ascii="Arial" w:eastAsia="Calibri" w:hAnsi="Arial" w:cs="Arial"/>
+          <w:bCs/>
+          <w:iCs/>
+          <w:color w:val="000000"/>
+        </w:rPr>
+        <w:t xml:space="preserve"> </w:t>
+      </w:r>
+      <w:r>
+        <w:rPr>
+          <w:rFonts w:ascii="Arial" w:eastAsia="Calibri" w:hAnsi="Arial" w:cs="Arial"/>
+          <w:bCs/>
+          <w:iCs/>
+          <w:color w:val="000000"/>
+        </w:rPr>
+        <w:t>Para la cuarta entrega, utilice Gemini para que me diga para que sirve cada elemento de un diagrama BPMN y me realice una tabla comparativa con ejemplos para cada uso.</w:t>
+      </w:r>
+    </w:p>
+    <w:p>
+      <w:pPr>
+        <w:keepNext/>
+        <w:keepLines/>
+        <w:pBdr>
+          <w:top w:val="nil"/>
+          <w:left w:val="nil"/>
+          <w:bottom w:val="nil"/>
+          <w:right w:val="nil"/>
+          <w:between w:val="nil"/>
+        </w:pBdr>
+        <w:spacing w:before="200" w:after="120"/>
+        <w:ind w:firstLine="0"/>
+        <w:rPr>
+          <w:rFonts w:ascii="Arial" w:eastAsia="Calibri" w:hAnsi="Arial" w:cs="Arial"/>
+          <w:bCs/>
+          <w:iCs/>
+          <w:color w:val="000000"/>
+        </w:rPr>
+      </w:pPr>
+    </w:p>
+    <w:p>
+      <w:pPr>
+        <w:keepNext/>
+        <w:keepLines/>
+        <w:pBdr>
+          <w:top w:val="nil"/>
+          <w:left w:val="nil"/>
+          <w:bottom w:val="nil"/>
+          <w:right w:val="nil"/>
+          <w:between w:val="nil"/>
+        </w:pBdr>
+        <w:spacing w:before="200" w:after="120"/>
+        <w:ind w:firstLine="0"/>
+        <w:rPr>
+          <w:rFonts w:ascii="Arial" w:eastAsia="Calibri" w:hAnsi="Arial" w:cs="Arial"/>
+          <w:bCs/>
+          <w:iCs/>
+          <w:color w:val="000000"/>
+        </w:rPr>
+      </w:pPr>
+    </w:p>
+    <w:p>
+      <w:pPr>
+        <w:keepNext/>
+        <w:keepLines/>
+        <w:pBdr>
+          <w:top w:val="nil"/>
+          <w:left w:val="nil"/>
+          <w:bottom w:val="nil"/>
+          <w:right w:val="nil"/>
+          <w:between w:val="nil"/>
+        </w:pBdr>
+        <w:spacing w:before="200" w:after="120"/>
+        <w:ind w:firstLine="0"/>
+        <w:rPr>
+          <w:rFonts w:ascii="Arial" w:eastAsia="Calibri" w:hAnsi="Arial" w:cs="Arial"/>
+          <w:bCs/>
+          <w:iCs/>
+          <w:color w:val="000000"/>
+        </w:rPr>
+      </w:pPr>
+    </w:p>
+    <w:p>
+      <w:pPr>
+        <w:keepNext/>
+        <w:keepLines/>
+        <w:pBdr>
+          <w:top w:val="nil"/>
+          <w:left w:val="nil"/>
+          <w:bottom w:val="nil"/>
+          <w:right w:val="nil"/>
+          <w:between w:val="nil"/>
+        </w:pBdr>
+        <w:spacing w:before="200" w:after="120"/>
+        <w:ind w:firstLine="0"/>
+        <w:rPr>
+          <w:rFonts w:ascii="Arial" w:eastAsia="Calibri" w:hAnsi="Arial" w:cs="Arial"/>
+          <w:bCs/>
+          <w:iCs/>
+          <w:color w:val="000000"/>
+        </w:rPr>
+      </w:pPr>
+    </w:p>
+    <w:p>
+      <w:pPr>
         <w:pStyle w:val="Ttulo1"/>
         <w:rPr>
           <w:rFonts w:eastAsia="Calibri"/>
         </w:rPr>
       </w:pPr>
-      <w:bookmarkStart w:id="24" w:name="_9gty2pto9dg2" w:colFirst="0" w:colLast="0"/>
-      <w:bookmarkStart w:id="25" w:name="_Toc243164939"/>
-      <w:bookmarkEnd w:id="24"/>
+      <w:bookmarkStart w:id="26" w:name="_9gty2pto9dg2" w:colFirst="0" w:colLast="0"/>
+      <w:bookmarkStart w:id="27" w:name="_Toc243313154"/>
+      <w:bookmarkEnd w:id="26"/>
       <w:r>
         <w:rPr>
           <w:rFonts w:eastAsia="Calibri"/>
         </w:rPr>
         <w:t>Referencias</w:t>
       </w:r>
-      <w:bookmarkEnd w:id="25"/>
+      <w:bookmarkEnd w:id="27"/>
     </w:p>
     <w:p>
       <w:pPr>
@@ -11351,7 +12966,25 @@
           <w:b/>
           <w:bCs/>
         </w:rPr>
-        <w:t>Bertalanffy, L. von.</w:t>
+        <w:t xml:space="preserve">Bertalanffy, L. </w:t>
+      </w:r>
+      <w:proofErr w:type="spellStart"/>
+      <w:r>
+        <w:rPr>
+          <w:rFonts w:ascii="Arial" w:hAnsi="Arial" w:cs="Arial"/>
+          <w:b/>
+          <w:bCs/>
+        </w:rPr>
+        <w:t>von</w:t>
+      </w:r>
+      <w:proofErr w:type="spellEnd"/>
+      <w:r>
+        <w:rPr>
+          <w:rFonts w:ascii="Arial" w:hAnsi="Arial" w:cs="Arial"/>
+          <w:b/>
+          <w:bCs/>
+        </w:rPr>
+        <w:t>.</w:t>
       </w:r>
       <w:r>
         <w:rPr>
@@ -11365,8 +12998,72 @@
           <w:i/>
           <w:iCs/>
         </w:rPr>
-        <w:t>General System Theory: Foundations, Development, Applications</w:t>
-      </w:r>
+        <w:t xml:space="preserve">General </w:t>
+      </w:r>
+      <w:proofErr w:type="spellStart"/>
+      <w:r>
+        <w:rPr>
+          <w:rFonts w:ascii="Arial" w:hAnsi="Arial" w:cs="Arial"/>
+          <w:i/>
+          <w:iCs/>
+        </w:rPr>
+        <w:t>System</w:t>
+      </w:r>
+      <w:proofErr w:type="spellEnd"/>
+      <w:r>
+        <w:rPr>
+          <w:rFonts w:ascii="Arial" w:hAnsi="Arial" w:cs="Arial"/>
+          <w:i/>
+          <w:iCs/>
+        </w:rPr>
+        <w:t xml:space="preserve"> Theory: </w:t>
+      </w:r>
+      <w:proofErr w:type="spellStart"/>
+      <w:r>
+        <w:rPr>
+          <w:rFonts w:ascii="Arial" w:hAnsi="Arial" w:cs="Arial"/>
+          <w:i/>
+          <w:iCs/>
+        </w:rPr>
+        <w:t>Foundations</w:t>
+      </w:r>
+      <w:proofErr w:type="spellEnd"/>
+      <w:r>
+        <w:rPr>
+          <w:rFonts w:ascii="Arial" w:hAnsi="Arial" w:cs="Arial"/>
+          <w:i/>
+          <w:iCs/>
+        </w:rPr>
+        <w:t xml:space="preserve">, </w:t>
+      </w:r>
+      <w:proofErr w:type="spellStart"/>
+      <w:r>
+        <w:rPr>
+          <w:rFonts w:ascii="Arial" w:hAnsi="Arial" w:cs="Arial"/>
+          <w:i/>
+          <w:iCs/>
+        </w:rPr>
+        <w:t>Development</w:t>
+      </w:r>
+      <w:proofErr w:type="spellEnd"/>
+      <w:r>
+        <w:rPr>
+          <w:rFonts w:ascii="Arial" w:hAnsi="Arial" w:cs="Arial"/>
+          <w:i/>
+          <w:iCs/>
+        </w:rPr>
+        <w:t xml:space="preserve">, </w:t>
+      </w:r>
+      <w:proofErr w:type="spellStart"/>
+      <w:r>
+        <w:rPr>
+          <w:rFonts w:ascii="Arial" w:hAnsi="Arial" w:cs="Arial"/>
+          <w:i/>
+          <w:iCs/>
+        </w:rPr>
+        <w:t>Applications</w:t>
+      </w:r>
+      <w:proofErr w:type="spellEnd"/>
       <w:r>
         <w:rPr>
           <w:rFonts w:ascii="Arial" w:hAnsi="Arial" w:cs="Arial"/>
@@ -11382,13 +13079,41 @@
           <w:rFonts w:ascii="Arial" w:hAnsi="Arial" w:cs="Arial"/>
         </w:rPr>
       </w:pPr>
+      <w:proofErr w:type="spellStart"/>
       <w:r>
         <w:rPr>
           <w:rFonts w:ascii="Arial" w:hAnsi="Arial" w:cs="Arial"/>
           <w:b/>
           <w:bCs/>
         </w:rPr>
-        <w:t>Cortagerena, A., y Freijedo, C.</w:t>
+        <w:t>Cortagerena</w:t>
+      </w:r>
+      <w:proofErr w:type="spellEnd"/>
+      <w:r>
+        <w:rPr>
+          <w:rFonts w:ascii="Arial" w:hAnsi="Arial" w:cs="Arial"/>
+          <w:b/>
+          <w:bCs/>
+        </w:rPr>
+        <w:t xml:space="preserve">, A., y </w:t>
+      </w:r>
+      <w:proofErr w:type="spellStart"/>
+      <w:r>
+        <w:rPr>
+          <w:rFonts w:ascii="Arial" w:hAnsi="Arial" w:cs="Arial"/>
+          <w:b/>
+          <w:bCs/>
+        </w:rPr>
+        <w:t>Freijedo</w:t>
+      </w:r>
+      <w:proofErr w:type="spellEnd"/>
+      <w:r>
+        <w:rPr>
+          <w:rFonts w:ascii="Arial" w:hAnsi="Arial" w:cs="Arial"/>
+          <w:b/>
+          <w:bCs/>
+        </w:rPr>
+        <w:t>, C.</w:t>
       </w:r>
       <w:r>
         <w:rPr>
@@ -11419,13 +13144,41 @@
           <w:rFonts w:ascii="Arial" w:hAnsi="Arial" w:cs="Arial"/>
         </w:rPr>
       </w:pPr>
+      <w:proofErr w:type="spellStart"/>
       <w:r>
         <w:rPr>
           <w:rFonts w:ascii="Arial" w:hAnsi="Arial" w:cs="Arial"/>
           <w:b/>
           <w:bCs/>
         </w:rPr>
-        <w:t>Gutierrez Gomez, G.</w:t>
+        <w:t>Gutierrez</w:t>
+      </w:r>
+      <w:proofErr w:type="spellEnd"/>
+      <w:r>
+        <w:rPr>
+          <w:rFonts w:ascii="Arial" w:hAnsi="Arial" w:cs="Arial"/>
+          <w:b/>
+          <w:bCs/>
+        </w:rPr>
+        <w:t xml:space="preserve"> </w:t>
+      </w:r>
+      <w:proofErr w:type="spellStart"/>
+      <w:r>
+        <w:rPr>
+          <w:rFonts w:ascii="Arial" w:hAnsi="Arial" w:cs="Arial"/>
+          <w:b/>
+          <w:bCs/>
+        </w:rPr>
+        <w:t>Gomez</w:t>
+      </w:r>
+      <w:proofErr w:type="spellEnd"/>
+      <w:r>
+        <w:rPr>
+          <w:rFonts w:ascii="Arial" w:hAnsi="Arial" w:cs="Arial"/>
+          <w:b/>
+          <w:bCs/>
+        </w:rPr>
+        <w:t>, G.</w:t>
       </w:r>
       <w:r>
         <w:rPr>
@@ -11456,13 +13209,23 @@
           <w:rFonts w:ascii="Arial" w:hAnsi="Arial" w:cs="Arial"/>
         </w:rPr>
       </w:pPr>
+      <w:proofErr w:type="spellStart"/>
       <w:r>
         <w:rPr>
           <w:rFonts w:ascii="Arial" w:hAnsi="Arial" w:cs="Arial"/>
           <w:b/>
           <w:bCs/>
         </w:rPr>
-        <w:t>Skyttner, L.</w:t>
+        <w:t>Skyttner</w:t>
+      </w:r>
+      <w:proofErr w:type="spellEnd"/>
+      <w:r>
+        <w:rPr>
+          <w:rFonts w:ascii="Arial" w:hAnsi="Arial" w:cs="Arial"/>
+          <w:b/>
+          <w:bCs/>
+        </w:rPr>
+        <w:t>, L.</w:t>
       </w:r>
       <w:r>
         <w:rPr>
@@ -11476,13 +13239,105 @@
           <w:i/>
           <w:iCs/>
         </w:rPr>
-        <w:t>General Systems Theory: Problems, Perspectives, Practice</w:t>
-      </w:r>
-      <w:r>
-        <w:rPr>
-          <w:rFonts w:ascii="Arial" w:hAnsi="Arial" w:cs="Arial"/>
-        </w:rPr>
-        <w:t xml:space="preserve"> (2nd ed.). Singapore: World Scientific Publishing.</w:t>
+        <w:t xml:space="preserve">General </w:t>
+      </w:r>
+      <w:proofErr w:type="spellStart"/>
+      <w:r>
+        <w:rPr>
+          <w:rFonts w:ascii="Arial" w:hAnsi="Arial" w:cs="Arial"/>
+          <w:i/>
+          <w:iCs/>
+        </w:rPr>
+        <w:t>Systems</w:t>
+      </w:r>
+      <w:proofErr w:type="spellEnd"/>
+      <w:r>
+        <w:rPr>
+          <w:rFonts w:ascii="Arial" w:hAnsi="Arial" w:cs="Arial"/>
+          <w:i/>
+          <w:iCs/>
+        </w:rPr>
+        <w:t xml:space="preserve"> Theory: </w:t>
+      </w:r>
+      <w:proofErr w:type="spellStart"/>
+      <w:r>
+        <w:rPr>
+          <w:rFonts w:ascii="Arial" w:hAnsi="Arial" w:cs="Arial"/>
+          <w:i/>
+          <w:iCs/>
+        </w:rPr>
+        <w:t>Problems</w:t>
+      </w:r>
+      <w:proofErr w:type="spellEnd"/>
+      <w:r>
+        <w:rPr>
+          <w:rFonts w:ascii="Arial" w:hAnsi="Arial" w:cs="Arial"/>
+          <w:i/>
+          <w:iCs/>
+        </w:rPr>
+        <w:t xml:space="preserve">, </w:t>
+      </w:r>
+      <w:proofErr w:type="spellStart"/>
+      <w:r>
+        <w:rPr>
+          <w:rFonts w:ascii="Arial" w:hAnsi="Arial" w:cs="Arial"/>
+          <w:i/>
+          <w:iCs/>
+        </w:rPr>
+        <w:t>Perspectives</w:t>
+      </w:r>
+      <w:proofErr w:type="spellEnd"/>
+      <w:r>
+        <w:rPr>
+          <w:rFonts w:ascii="Arial" w:hAnsi="Arial" w:cs="Arial"/>
+          <w:i/>
+          <w:iCs/>
+        </w:rPr>
+        <w:t xml:space="preserve">, </w:t>
+      </w:r>
+      <w:proofErr w:type="spellStart"/>
+      <w:r>
+        <w:rPr>
+          <w:rFonts w:ascii="Arial" w:hAnsi="Arial" w:cs="Arial"/>
+          <w:i/>
+          <w:iCs/>
+        </w:rPr>
+        <w:t>Practice</w:t>
+      </w:r>
+      <w:proofErr w:type="spellEnd"/>
+      <w:r>
+        <w:rPr>
+          <w:rFonts w:ascii="Arial" w:hAnsi="Arial" w:cs="Arial"/>
+        </w:rPr>
+        <w:t xml:space="preserve"> (2nd ed.). </w:t>
+      </w:r>
+      <w:proofErr w:type="spellStart"/>
+      <w:r>
+        <w:rPr>
+          <w:rFonts w:ascii="Arial" w:hAnsi="Arial" w:cs="Arial"/>
+        </w:rPr>
+        <w:t>Singapore</w:t>
+      </w:r>
+      <w:proofErr w:type="spellEnd"/>
+      <w:r>
+        <w:rPr>
+          <w:rFonts w:ascii="Arial" w:hAnsi="Arial" w:cs="Arial"/>
+        </w:rPr>
+        <w:t xml:space="preserve">: World </w:t>
+      </w:r>
+      <w:proofErr w:type="spellStart"/>
+      <w:r>
+        <w:rPr>
+          <w:rFonts w:ascii="Arial" w:hAnsi="Arial" w:cs="Arial"/>
+        </w:rPr>
+        <w:t>Scientific</w:t>
+      </w:r>
+      <w:proofErr w:type="spellEnd"/>
+      <w:r>
+        <w:rPr>
+          <w:rFonts w:ascii="Arial" w:hAnsi="Arial" w:cs="Arial"/>
+        </w:rPr>
+        <w:t xml:space="preserve"> Publishing.</w:t>
       </w:r>
     </w:p>
     <w:p>
@@ -11513,8 +13368,54 @@
           <w:i/>
           <w:iCs/>
         </w:rPr>
-        <w:t>Software Engineering: A Practitioner's Approach</w:t>
-      </w:r>
+        <w:t xml:space="preserve">Software </w:t>
+      </w:r>
+      <w:proofErr w:type="spellStart"/>
+      <w:r>
+        <w:rPr>
+          <w:rFonts w:ascii="Arial" w:hAnsi="Arial" w:cs="Arial"/>
+          <w:i/>
+          <w:iCs/>
+        </w:rPr>
+        <w:t>Engineering</w:t>
+      </w:r>
+      <w:proofErr w:type="spellEnd"/>
+      <w:r>
+        <w:rPr>
+          <w:rFonts w:ascii="Arial" w:hAnsi="Arial" w:cs="Arial"/>
+          <w:i/>
+          <w:iCs/>
+        </w:rPr>
+        <w:t xml:space="preserve">: A </w:t>
+      </w:r>
+      <w:proofErr w:type="spellStart"/>
+      <w:r>
+        <w:rPr>
+          <w:rFonts w:ascii="Arial" w:hAnsi="Arial" w:cs="Arial"/>
+          <w:i/>
+          <w:iCs/>
+        </w:rPr>
+        <w:t>Practitioner's</w:t>
+      </w:r>
+      <w:proofErr w:type="spellEnd"/>
+      <w:r>
+        <w:rPr>
+          <w:rFonts w:ascii="Arial" w:hAnsi="Arial" w:cs="Arial"/>
+          <w:i/>
+          <w:iCs/>
+        </w:rPr>
+        <w:t xml:space="preserve"> </w:t>
+      </w:r>
+      <w:proofErr w:type="spellStart"/>
+      <w:r>
+        <w:rPr>
+          <w:rFonts w:ascii="Arial" w:hAnsi="Arial" w:cs="Arial"/>
+          <w:i/>
+          <w:iCs/>
+        </w:rPr>
+        <w:t>Approach</w:t>
+      </w:r>
+      <w:proofErr w:type="spellEnd"/>
       <w:r>
         <w:rPr>
           <w:rFonts w:ascii="Arial" w:hAnsi="Arial" w:cs="Arial"/>
@@ -11550,8 +13451,18 @@
           <w:i/>
           <w:iCs/>
         </w:rPr>
-        <w:t>Software Engineering</w:t>
-      </w:r>
+        <w:t xml:space="preserve">Software </w:t>
+      </w:r>
+      <w:proofErr w:type="spellStart"/>
+      <w:r>
+        <w:rPr>
+          <w:rFonts w:ascii="Arial" w:hAnsi="Arial" w:cs="Arial"/>
+          <w:i/>
+          <w:iCs/>
+        </w:rPr>
+        <w:t>Engineering</w:t>
+      </w:r>
+      <w:proofErr w:type="spellEnd"/>
       <w:r>
         <w:rPr>
           <w:rFonts w:ascii="Arial" w:hAnsi="Arial" w:cs="Arial"/>
@@ -11587,8 +13498,72 @@
           <w:i/>
           <w:iCs/>
         </w:rPr>
-        <w:t>General Systems Theory—The Skeleton of Science</w:t>
-      </w:r>
+        <w:t xml:space="preserve">General </w:t>
+      </w:r>
+      <w:proofErr w:type="spellStart"/>
+      <w:r>
+        <w:rPr>
+          <w:rFonts w:ascii="Arial" w:hAnsi="Arial" w:cs="Arial"/>
+          <w:i/>
+          <w:iCs/>
+        </w:rPr>
+        <w:t>Systems</w:t>
+      </w:r>
+      <w:proofErr w:type="spellEnd"/>
+      <w:r>
+        <w:rPr>
+          <w:rFonts w:ascii="Arial" w:hAnsi="Arial" w:cs="Arial"/>
+          <w:i/>
+          <w:iCs/>
+        </w:rPr>
+        <w:t xml:space="preserve"> Theory—The </w:t>
+      </w:r>
+      <w:proofErr w:type="spellStart"/>
+      <w:r>
+        <w:rPr>
+          <w:rFonts w:ascii="Arial" w:hAnsi="Arial" w:cs="Arial"/>
+          <w:i/>
+          <w:iCs/>
+        </w:rPr>
+        <w:t>Skeleton</w:t>
+      </w:r>
+      <w:proofErr w:type="spellEnd"/>
+      <w:r>
+        <w:rPr>
+          <w:rFonts w:ascii="Arial" w:hAnsi="Arial" w:cs="Arial"/>
+          <w:i/>
+          <w:iCs/>
+        </w:rPr>
+        <w:t xml:space="preserve"> </w:t>
+      </w:r>
+      <w:proofErr w:type="spellStart"/>
+      <w:r>
+        <w:rPr>
+          <w:rFonts w:ascii="Arial" w:hAnsi="Arial" w:cs="Arial"/>
+          <w:i/>
+          <w:iCs/>
+        </w:rPr>
+        <w:t>of</w:t>
+      </w:r>
+      <w:proofErr w:type="spellEnd"/>
+      <w:r>
+        <w:rPr>
+          <w:rFonts w:ascii="Arial" w:hAnsi="Arial" w:cs="Arial"/>
+          <w:i/>
+          <w:iCs/>
+        </w:rPr>
+        <w:t xml:space="preserve"> </w:t>
+      </w:r>
+      <w:proofErr w:type="spellStart"/>
+      <w:r>
+        <w:rPr>
+          <w:rFonts w:ascii="Arial" w:hAnsi="Arial" w:cs="Arial"/>
+          <w:i/>
+          <w:iCs/>
+        </w:rPr>
+        <w:t>Science</w:t>
+      </w:r>
+      <w:proofErr w:type="spellEnd"/>
       <w:r>
         <w:rPr>
           <w:rFonts w:ascii="Arial" w:hAnsi="Arial" w:cs="Arial"/>
@@ -11601,11 +13576,19 @@
         </w:rPr>
         <w:t xml:space="preserve"> </w:t>
       </w:r>
-      <w:r>
-        <w:rPr>
-          <w:rFonts w:ascii="Arial" w:hAnsi="Arial" w:cs="Arial"/>
-        </w:rPr>
-        <w:t>Science, 2(3), 197–208</w:t>
+      <w:proofErr w:type="spellStart"/>
+      <w:r>
+        <w:rPr>
+          <w:rFonts w:ascii="Arial" w:hAnsi="Arial" w:cs="Arial"/>
+        </w:rPr>
+        <w:t>Science</w:t>
+      </w:r>
+      <w:proofErr w:type="spellEnd"/>
+      <w:r>
+        <w:rPr>
+          <w:rFonts w:ascii="Arial" w:hAnsi="Arial" w:cs="Arial"/>
+        </w:rPr>
+        <w:t>, 2(3), 197–208</w:t>
       </w:r>
       <w:r>
         <w:rPr>
@@ -11642,8 +13625,18 @@
           <w:b/>
           <w:bCs/>
         </w:rPr>
-        <w:t>Ramos Sásamo</w:t>
-      </w:r>
+        <w:t xml:space="preserve">Ramos </w:t>
+      </w:r>
+      <w:proofErr w:type="spellStart"/>
+      <w:r>
+        <w:rPr>
+          <w:rFonts w:ascii="Arial" w:hAnsi="Arial" w:cs="Arial"/>
+          <w:b/>
+          <w:bCs/>
+        </w:rPr>
+        <w:t>Sásamo</w:t>
+      </w:r>
+      <w:proofErr w:type="spellEnd"/>
       <w:r>
         <w:rPr>
           <w:rFonts w:ascii="Arial" w:hAnsi="Arial" w:cs="Arial"/>
@@ -11676,7 +13669,21 @@
         <w:rPr>
           <w:rFonts w:ascii="Arial" w:hAnsi="Arial" w:cs="Arial"/>
         </w:rPr>
-        <w:t>.(2018) Elementos Bási-cos de</w:t>
+        <w:t xml:space="preserve">.(2018) Elementos </w:t>
+      </w:r>
+      <w:proofErr w:type="spellStart"/>
+      <w:r>
+        <w:rPr>
+          <w:rFonts w:ascii="Arial" w:hAnsi="Arial" w:cs="Arial"/>
+        </w:rPr>
+        <w:t>Bási</w:t>
+      </w:r>
+      <w:proofErr w:type="spellEnd"/>
+      <w:r>
+        <w:rPr>
+          <w:rFonts w:ascii="Arial" w:hAnsi="Arial" w:cs="Arial"/>
+        </w:rPr>
+        <w:t>-cos de</w:t>
       </w:r>
       <w:r>
         <w:rPr>
@@ -11725,7 +13732,7 @@
         </w:rPr>
         <w:t xml:space="preserve">con 9 ejemplos prácticos: ( ed.). Bubok Publishing S.L. </w:t>
       </w:r>
-      <w:hyperlink r:id="rId16" w:history="1">
+      <w:hyperlink r:id="rId22" w:history="1">
         <w:r>
           <w:rPr>
             <w:rStyle w:val="Hipervnculo"/>
@@ -11740,11 +13747,19 @@
         </w:rPr>
         <w:t xml:space="preserve"> </w:t>
       </w:r>
-      <w:r>
-        <w:rPr>
-          <w:rFonts w:ascii="Arial" w:hAnsi="Arial" w:cs="Arial"/>
-        </w:rPr>
-        <w:t>tulos/189293</w:t>
+      <w:proofErr w:type="spellStart"/>
+      <w:r>
+        <w:rPr>
+          <w:rFonts w:ascii="Arial" w:hAnsi="Arial" w:cs="Arial"/>
+        </w:rPr>
+        <w:t>tulos</w:t>
+      </w:r>
+      <w:proofErr w:type="spellEnd"/>
+      <w:r>
+        <w:rPr>
+          <w:rFonts w:ascii="Arial" w:hAnsi="Arial" w:cs="Arial"/>
+        </w:rPr>
+        <w:t>/189293</w:t>
       </w:r>
     </w:p>
     <w:p>
@@ -11807,7 +13822,6 @@
           <w:b/>
           <w:bCs/>
         </w:rPr>
-        <w:lastRenderedPageBreak/>
         <w:t>Hernández Sánchez, J. M.</w:t>
       </w:r>
       <w:r>
@@ -11822,11 +13836,19 @@
         </w:rPr>
         <w:t xml:space="preserve"> </w:t>
       </w:r>
-      <w:r>
-        <w:rPr>
-          <w:rFonts w:ascii="Arial" w:hAnsi="Arial" w:cs="Arial"/>
-        </w:rPr>
-        <w:t>Ecoe Ediciones. https://elibro.net/es/lc/utnfrm/titulos/70451</w:t>
+      <w:proofErr w:type="spellStart"/>
+      <w:r>
+        <w:rPr>
+          <w:rFonts w:ascii="Arial" w:hAnsi="Arial" w:cs="Arial"/>
+        </w:rPr>
+        <w:t>Ecoe</w:t>
+      </w:r>
+      <w:proofErr w:type="spellEnd"/>
+      <w:r>
+        <w:rPr>
+          <w:rFonts w:ascii="Arial" w:hAnsi="Arial" w:cs="Arial"/>
+        </w:rPr>
+        <w:t xml:space="preserve"> Ediciones. https://elibro.net/es/lc/utnfrm/titulos/70451</w:t>
       </w:r>
     </w:p>
     <w:p>
@@ -11894,11 +13916,11 @@
       <w:pPr>
         <w:pStyle w:val="Ttulo1"/>
       </w:pPr>
-      <w:bookmarkStart w:id="26" w:name="_Toc243164940"/>
+      <w:bookmarkStart w:id="28" w:name="_Toc243313155"/>
       <w:r>
         <w:t>Materiales de la Cátedra (UTN):</w:t>
       </w:r>
-      <w:bookmarkEnd w:id="26"/>
+      <w:bookmarkEnd w:id="28"/>
     </w:p>
     <w:p>
       <w:pPr>
@@ -11980,6 +14002,7 @@
         <w:rPr>
           <w:rFonts w:ascii="Arial" w:hAnsi="Arial" w:cs="Arial"/>
         </w:rPr>
+        <w:lastRenderedPageBreak/>
         <w:t xml:space="preserve">Cátedra de Organización Empresarial. (2024). </w:t>
       </w:r>
       <w:r>
@@ -11988,7 +14011,25 @@
           <w:i/>
           <w:iCs/>
         </w:rPr>
-        <w:t>Unidad 2: Organización y Empresa. Introducción: La Organización como un Puzzle Viviente</w:t>
+        <w:t xml:space="preserve">Unidad 2: Organización y Empresa. Introducción: La Organización como un </w:t>
+      </w:r>
+      <w:proofErr w:type="spellStart"/>
+      <w:r>
+        <w:rPr>
+          <w:rFonts w:ascii="Arial" w:hAnsi="Arial" w:cs="Arial"/>
+          <w:i/>
+          <w:iCs/>
+        </w:rPr>
+        <w:t>Puzzle</w:t>
+      </w:r>
+      <w:proofErr w:type="spellEnd"/>
+      <w:r>
+        <w:rPr>
+          <w:rFonts w:ascii="Arial" w:hAnsi="Arial" w:cs="Arial"/>
+          <w:i/>
+          <w:iCs/>
+        </w:rPr>
+        <w:t xml:space="preserve"> Viviente</w:t>
       </w:r>
       <w:r>
         <w:rPr>
@@ -13147,6 +15188,119 @@
     </w:lvl>
   </w:abstractNum>
   <w:abstractNum w:abstractNumId="7" w15:restartNumberingAfterBreak="0">
+    <w:nsid w:val="28021380"/>
+    <w:multiLevelType w:val="hybridMultilevel"/>
+    <w:tmpl w:val="24BCA4B6"/>
+    <w:lvl w:ilvl="0" w:tplc="2C0A0001">
+      <w:start w:val="1"/>
+      <w:numFmt w:val="bullet"/>
+      <w:lvlText w:val=""/>
+      <w:lvlJc w:val="left"/>
+      <w:pPr>
+        <w:ind w:left="720" w:hanging="360"/>
+      </w:pPr>
+      <w:rPr>
+        <w:rFonts w:ascii="Symbol" w:hAnsi="Symbol" w:hint="default"/>
+      </w:rPr>
+    </w:lvl>
+    <w:lvl w:ilvl="1" w:tplc="2C0A0003" w:tentative="1">
+      <w:start w:val="1"/>
+      <w:numFmt w:val="bullet"/>
+      <w:lvlText w:val="o"/>
+      <w:lvlJc w:val="left"/>
+      <w:pPr>
+        <w:ind w:left="1440" w:hanging="360"/>
+      </w:pPr>
+      <w:rPr>
+        <w:rFonts w:ascii="Courier New" w:hAnsi="Courier New" w:cs="Courier New" w:hint="default"/>
+      </w:rPr>
+    </w:lvl>
+    <w:lvl w:ilvl="2" w:tplc="2C0A0005" w:tentative="1">
+      <w:start w:val="1"/>
+      <w:numFmt w:val="bullet"/>
+      <w:lvlText w:val=""/>
+      <w:lvlJc w:val="left"/>
+      <w:pPr>
+        <w:ind w:left="2160" w:hanging="360"/>
+      </w:pPr>
+      <w:rPr>
+        <w:rFonts w:ascii="Wingdings" w:hAnsi="Wingdings" w:hint="default"/>
+      </w:rPr>
+    </w:lvl>
+    <w:lvl w:ilvl="3" w:tplc="2C0A0001" w:tentative="1">
+      <w:start w:val="1"/>
+      <w:numFmt w:val="bullet"/>
+      <w:lvlText w:val=""/>
+      <w:lvlJc w:val="left"/>
+      <w:pPr>
+        <w:ind w:left="2880" w:hanging="360"/>
+      </w:pPr>
+      <w:rPr>
+        <w:rFonts w:ascii="Symbol" w:hAnsi="Symbol" w:hint="default"/>
+      </w:rPr>
+    </w:lvl>
+    <w:lvl w:ilvl="4" w:tplc="2C0A0003" w:tentative="1">
+      <w:start w:val="1"/>
+      <w:numFmt w:val="bullet"/>
+      <w:lvlText w:val="o"/>
+      <w:lvlJc w:val="left"/>
+      <w:pPr>
+        <w:ind w:left="3600" w:hanging="360"/>
+      </w:pPr>
+      <w:rPr>
+        <w:rFonts w:ascii="Courier New" w:hAnsi="Courier New" w:cs="Courier New" w:hint="default"/>
+      </w:rPr>
+    </w:lvl>
+    <w:lvl w:ilvl="5" w:tplc="2C0A0005" w:tentative="1">
+      <w:start w:val="1"/>
+      <w:numFmt w:val="bullet"/>
+      <w:lvlText w:val=""/>
+      <w:lvlJc w:val="left"/>
+      <w:pPr>
+        <w:ind w:left="4320" w:hanging="360"/>
+      </w:pPr>
+      <w:rPr>
+        <w:rFonts w:ascii="Wingdings" w:hAnsi="Wingdings" w:hint="default"/>
+      </w:rPr>
+    </w:lvl>
+    <w:lvl w:ilvl="6" w:tplc="2C0A0001" w:tentative="1">
+      <w:start w:val="1"/>
+      <w:numFmt w:val="bullet"/>
+      <w:lvlText w:val=""/>
+      <w:lvlJc w:val="left"/>
+      <w:pPr>
+        <w:ind w:left="5040" w:hanging="360"/>
+      </w:pPr>
+      <w:rPr>
+        <w:rFonts w:ascii="Symbol" w:hAnsi="Symbol" w:hint="default"/>
+      </w:rPr>
+    </w:lvl>
+    <w:lvl w:ilvl="7" w:tplc="2C0A0003" w:tentative="1">
+      <w:start w:val="1"/>
+      <w:numFmt w:val="bullet"/>
+      <w:lvlText w:val="o"/>
+      <w:lvlJc w:val="left"/>
+      <w:pPr>
+        <w:ind w:left="5760" w:hanging="360"/>
+      </w:pPr>
+      <w:rPr>
+        <w:rFonts w:ascii="Courier New" w:hAnsi="Courier New" w:cs="Courier New" w:hint="default"/>
+      </w:rPr>
+    </w:lvl>
+    <w:lvl w:ilvl="8" w:tplc="2C0A0005" w:tentative="1">
+      <w:start w:val="1"/>
+      <w:numFmt w:val="bullet"/>
+      <w:lvlText w:val=""/>
+      <w:lvlJc w:val="left"/>
+      <w:pPr>
+        <w:ind w:left="6480" w:hanging="360"/>
+      </w:pPr>
+      <w:rPr>
+        <w:rFonts w:ascii="Wingdings" w:hAnsi="Wingdings" w:hint="default"/>
+      </w:rPr>
+    </w:lvl>
+  </w:abstractNum>
+  <w:abstractNum w:abstractNumId="8" w15:restartNumberingAfterBreak="0">
     <w:nsid w:val="2829650B"/>
     <w:multiLevelType w:val="hybridMultilevel"/>
     <w:tmpl w:val="F104C250"/>
@@ -13259,7 +15413,7 @@
       </w:rPr>
     </w:lvl>
   </w:abstractNum>
-  <w:abstractNum w:abstractNumId="8" w15:restartNumberingAfterBreak="0">
+  <w:abstractNum w:abstractNumId="9" w15:restartNumberingAfterBreak="0">
     <w:nsid w:val="2B7B4B5B"/>
     <w:multiLevelType w:val="hybridMultilevel"/>
     <w:tmpl w:val="427020E0"/>
@@ -13373,7 +15527,7 @@
       </w:rPr>
     </w:lvl>
   </w:abstractNum>
-  <w:abstractNum w:abstractNumId="9" w15:restartNumberingAfterBreak="0">
+  <w:abstractNum w:abstractNumId="10" w15:restartNumberingAfterBreak="0">
     <w:nsid w:val="2DCA5D6F"/>
     <w:multiLevelType w:val="hybridMultilevel"/>
     <w:tmpl w:val="A69C3F8E"/>
@@ -13488,7 +15642,7 @@
       </w:rPr>
     </w:lvl>
   </w:abstractNum>
-  <w:abstractNum w:abstractNumId="10" w15:restartNumberingAfterBreak="0">
+  <w:abstractNum w:abstractNumId="11" w15:restartNumberingAfterBreak="0">
     <w:nsid w:val="2F143DBF"/>
     <w:multiLevelType w:val="hybridMultilevel"/>
     <w:tmpl w:val="C2FE390C"/>
@@ -13601,7 +15755,7 @@
       </w:rPr>
     </w:lvl>
   </w:abstractNum>
-  <w:abstractNum w:abstractNumId="11" w15:restartNumberingAfterBreak="0">
+  <w:abstractNum w:abstractNumId="12" w15:restartNumberingAfterBreak="0">
     <w:nsid w:val="2F336238"/>
     <w:multiLevelType w:val="hybridMultilevel"/>
     <w:tmpl w:val="36E4216E"/>
@@ -13716,7 +15870,7 @@
       </w:rPr>
     </w:lvl>
   </w:abstractNum>
-  <w:abstractNum w:abstractNumId="12" w15:restartNumberingAfterBreak="0">
+  <w:abstractNum w:abstractNumId="13" w15:restartNumberingAfterBreak="0">
     <w:nsid w:val="3144497D"/>
     <w:multiLevelType w:val="hybridMultilevel"/>
     <w:tmpl w:val="06DECB20"/>
@@ -13830,7 +15984,7 @@
       </w:rPr>
     </w:lvl>
   </w:abstractNum>
-  <w:abstractNum w:abstractNumId="13" w15:restartNumberingAfterBreak="0">
+  <w:abstractNum w:abstractNumId="14" w15:restartNumberingAfterBreak="0">
     <w:nsid w:val="32220E92"/>
     <w:multiLevelType w:val="multilevel"/>
     <w:tmpl w:val="3F8898C4"/>
@@ -13979,7 +16133,7 @@
       </w:rPr>
     </w:lvl>
   </w:abstractNum>
-  <w:abstractNum w:abstractNumId="14" w15:restartNumberingAfterBreak="0">
+  <w:abstractNum w:abstractNumId="15" w15:restartNumberingAfterBreak="0">
     <w:nsid w:val="34607475"/>
     <w:multiLevelType w:val="hybridMultilevel"/>
     <w:tmpl w:val="59D00B8E"/>
@@ -14092,7 +16246,7 @@
       </w:rPr>
     </w:lvl>
   </w:abstractNum>
-  <w:abstractNum w:abstractNumId="15" w15:restartNumberingAfterBreak="0">
+  <w:abstractNum w:abstractNumId="16" w15:restartNumberingAfterBreak="0">
     <w:nsid w:val="394D0C34"/>
     <w:multiLevelType w:val="hybridMultilevel"/>
     <w:tmpl w:val="5968576E"/>
@@ -14207,7 +16361,7 @@
       </w:rPr>
     </w:lvl>
   </w:abstractNum>
-  <w:abstractNum w:abstractNumId="16" w15:restartNumberingAfterBreak="0">
+  <w:abstractNum w:abstractNumId="17" w15:restartNumberingAfterBreak="0">
     <w:nsid w:val="3D053A23"/>
     <w:multiLevelType w:val="hybridMultilevel"/>
     <w:tmpl w:val="EE5CBDFE"/>
@@ -14320,7 +16474,7 @@
       </w:rPr>
     </w:lvl>
   </w:abstractNum>
-  <w:abstractNum w:abstractNumId="17" w15:restartNumberingAfterBreak="0">
+  <w:abstractNum w:abstractNumId="18" w15:restartNumberingAfterBreak="0">
     <w:nsid w:val="4212778A"/>
     <w:multiLevelType w:val="hybridMultilevel"/>
     <w:tmpl w:val="4B4E78F8"/>
@@ -14437,7 +16591,7 @@
       </w:rPr>
     </w:lvl>
   </w:abstractNum>
-  <w:abstractNum w:abstractNumId="18" w15:restartNumberingAfterBreak="0">
+  <w:abstractNum w:abstractNumId="19" w15:restartNumberingAfterBreak="0">
     <w:nsid w:val="43030423"/>
     <w:multiLevelType w:val="hybridMultilevel"/>
     <w:tmpl w:val="44942CD6"/>
@@ -14530,7 +16684,7 @@
       </w:pPr>
     </w:lvl>
   </w:abstractNum>
-  <w:abstractNum w:abstractNumId="19" w15:restartNumberingAfterBreak="0">
+  <w:abstractNum w:abstractNumId="20" w15:restartNumberingAfterBreak="0">
     <w:nsid w:val="43D9228F"/>
     <w:multiLevelType w:val="hybridMultilevel"/>
     <w:tmpl w:val="5742FE9E"/>
@@ -14643,7 +16797,7 @@
       </w:rPr>
     </w:lvl>
   </w:abstractNum>
-  <w:abstractNum w:abstractNumId="20" w15:restartNumberingAfterBreak="0">
+  <w:abstractNum w:abstractNumId="21" w15:restartNumberingAfterBreak="0">
     <w:nsid w:val="476F4157"/>
     <w:multiLevelType w:val="hybridMultilevel"/>
     <w:tmpl w:val="A4C0EA8A"/>
@@ -14757,7 +16911,7 @@
       </w:rPr>
     </w:lvl>
   </w:abstractNum>
-  <w:abstractNum w:abstractNumId="21" w15:restartNumberingAfterBreak="0">
+  <w:abstractNum w:abstractNumId="22" w15:restartNumberingAfterBreak="0">
     <w:nsid w:val="48A63AE3"/>
     <w:multiLevelType w:val="hybridMultilevel"/>
     <w:tmpl w:val="A300E366"/>
@@ -14846,7 +17000,7 @@
       </w:pPr>
     </w:lvl>
   </w:abstractNum>
-  <w:abstractNum w:abstractNumId="22" w15:restartNumberingAfterBreak="0">
+  <w:abstractNum w:abstractNumId="23" w15:restartNumberingAfterBreak="0">
     <w:nsid w:val="4CC43BD7"/>
     <w:multiLevelType w:val="hybridMultilevel"/>
     <w:tmpl w:val="3D68466C"/>
@@ -14960,7 +17114,7 @@
       </w:rPr>
     </w:lvl>
   </w:abstractNum>
-  <w:abstractNum w:abstractNumId="23" w15:restartNumberingAfterBreak="0">
+  <w:abstractNum w:abstractNumId="24" w15:restartNumberingAfterBreak="0">
     <w:nsid w:val="4CD96F18"/>
     <w:multiLevelType w:val="hybridMultilevel"/>
     <w:tmpl w:val="96061108"/>
@@ -15077,7 +17231,7 @@
       </w:rPr>
     </w:lvl>
   </w:abstractNum>
-  <w:abstractNum w:abstractNumId="24" w15:restartNumberingAfterBreak="0">
+  <w:abstractNum w:abstractNumId="25" w15:restartNumberingAfterBreak="0">
     <w:nsid w:val="545B018B"/>
     <w:multiLevelType w:val="hybridMultilevel"/>
     <w:tmpl w:val="02BAF878"/>
@@ -15190,7 +17344,7 @@
       </w:rPr>
     </w:lvl>
   </w:abstractNum>
-  <w:abstractNum w:abstractNumId="25" w15:restartNumberingAfterBreak="0">
+  <w:abstractNum w:abstractNumId="26" w15:restartNumberingAfterBreak="0">
     <w:nsid w:val="61664C39"/>
     <w:multiLevelType w:val="hybridMultilevel"/>
     <w:tmpl w:val="897CCE1C"/>
@@ -15303,7 +17457,7 @@
       </w:rPr>
     </w:lvl>
   </w:abstractNum>
-  <w:abstractNum w:abstractNumId="26" w15:restartNumberingAfterBreak="0">
+  <w:abstractNum w:abstractNumId="27" w15:restartNumberingAfterBreak="0">
     <w:nsid w:val="647E11F8"/>
     <w:multiLevelType w:val="hybridMultilevel"/>
     <w:tmpl w:val="D0889B10"/>
@@ -15392,7 +17546,7 @@
       </w:pPr>
     </w:lvl>
   </w:abstractNum>
-  <w:abstractNum w:abstractNumId="27" w15:restartNumberingAfterBreak="0">
+  <w:abstractNum w:abstractNumId="28" w15:restartNumberingAfterBreak="0">
     <w:nsid w:val="6BBE1CC5"/>
     <w:multiLevelType w:val="multilevel"/>
     <w:tmpl w:val="E8AED820"/>
@@ -15505,7 +17659,7 @@
       </w:rPr>
     </w:lvl>
   </w:abstractNum>
-  <w:abstractNum w:abstractNumId="28" w15:restartNumberingAfterBreak="0">
+  <w:abstractNum w:abstractNumId="29" w15:restartNumberingAfterBreak="0">
     <w:nsid w:val="72242276"/>
     <w:multiLevelType w:val="hybridMultilevel"/>
     <w:tmpl w:val="CCF21DF6"/>
@@ -15618,7 +17772,7 @@
       </w:rPr>
     </w:lvl>
   </w:abstractNum>
-  <w:abstractNum w:abstractNumId="29" w15:restartNumberingAfterBreak="0">
+  <w:abstractNum w:abstractNumId="30" w15:restartNumberingAfterBreak="0">
     <w:nsid w:val="76BC6280"/>
     <w:multiLevelType w:val="hybridMultilevel"/>
     <w:tmpl w:val="87D6B54A"/>
@@ -15732,31 +17886,31 @@
     </w:lvl>
   </w:abstractNum>
   <w:num w:numId="1" w16cid:durableId="1780567199">
-    <w:abstractNumId w:val="27"/>
+    <w:abstractNumId w:val="28"/>
   </w:num>
   <w:num w:numId="2" w16cid:durableId="674235141">
-    <w:abstractNumId w:val="23"/>
+    <w:abstractNumId w:val="24"/>
   </w:num>
   <w:num w:numId="3" w16cid:durableId="1698312960">
-    <w:abstractNumId w:val="17"/>
+    <w:abstractNumId w:val="18"/>
   </w:num>
   <w:num w:numId="4" w16cid:durableId="855730274">
-    <w:abstractNumId w:val="18"/>
+    <w:abstractNumId w:val="19"/>
   </w:num>
   <w:num w:numId="5" w16cid:durableId="202907397">
-    <w:abstractNumId w:val="9"/>
+    <w:abstractNumId w:val="10"/>
   </w:num>
   <w:num w:numId="6" w16cid:durableId="731654094">
-    <w:abstractNumId w:val="15"/>
+    <w:abstractNumId w:val="16"/>
   </w:num>
   <w:num w:numId="7" w16cid:durableId="1633558946">
-    <w:abstractNumId w:val="11"/>
+    <w:abstractNumId w:val="12"/>
   </w:num>
   <w:num w:numId="8" w16cid:durableId="1564755439">
-    <w:abstractNumId w:val="20"/>
+    <w:abstractNumId w:val="21"/>
   </w:num>
   <w:num w:numId="9" w16cid:durableId="701631806">
-    <w:abstractNumId w:val="22"/>
+    <w:abstractNumId w:val="23"/>
   </w:num>
   <w:num w:numId="10" w16cid:durableId="879126905">
     <w:abstractNumId w:val="4"/>
@@ -15765,34 +17919,34 @@
     <w:abstractNumId w:val="3"/>
   </w:num>
   <w:num w:numId="12" w16cid:durableId="1581057674">
+    <w:abstractNumId w:val="9"/>
+  </w:num>
+  <w:num w:numId="13" w16cid:durableId="1482424985">
+    <w:abstractNumId w:val="20"/>
+  </w:num>
+  <w:num w:numId="14" w16cid:durableId="1108239527">
+    <w:abstractNumId w:val="13"/>
+  </w:num>
+  <w:num w:numId="15" w16cid:durableId="441922486">
+    <w:abstractNumId w:val="14"/>
+  </w:num>
+  <w:num w:numId="16" w16cid:durableId="1449813527">
+    <w:abstractNumId w:val="22"/>
+  </w:num>
+  <w:num w:numId="17" w16cid:durableId="1086926366">
+    <w:abstractNumId w:val="11"/>
+  </w:num>
+  <w:num w:numId="18" w16cid:durableId="329338124">
+    <w:abstractNumId w:val="26"/>
+  </w:num>
+  <w:num w:numId="19" w16cid:durableId="998003611">
     <w:abstractNumId w:val="8"/>
   </w:num>
-  <w:num w:numId="13" w16cid:durableId="1482424985">
-    <w:abstractNumId w:val="19"/>
-  </w:num>
-  <w:num w:numId="14" w16cid:durableId="1108239527">
-    <w:abstractNumId w:val="12"/>
-  </w:num>
-  <w:num w:numId="15" w16cid:durableId="441922486">
-    <w:abstractNumId w:val="13"/>
-  </w:num>
-  <w:num w:numId="16" w16cid:durableId="1449813527">
-    <w:abstractNumId w:val="21"/>
-  </w:num>
-  <w:num w:numId="17" w16cid:durableId="1086926366">
-    <w:abstractNumId w:val="10"/>
-  </w:num>
-  <w:num w:numId="18" w16cid:durableId="329338124">
+  <w:num w:numId="20" w16cid:durableId="1741445592">
     <w:abstractNumId w:val="25"/>
   </w:num>
-  <w:num w:numId="19" w16cid:durableId="998003611">
-    <w:abstractNumId w:val="7"/>
-  </w:num>
-  <w:num w:numId="20" w16cid:durableId="1741445592">
-    <w:abstractNumId w:val="24"/>
-  </w:num>
   <w:num w:numId="21" w16cid:durableId="661347921">
-    <w:abstractNumId w:val="28"/>
+    <w:abstractNumId w:val="29"/>
   </w:num>
   <w:num w:numId="22" w16cid:durableId="352339226">
     <w:abstractNumId w:val="5"/>
@@ -15801,7 +17955,7 @@
     <w:abstractNumId w:val="6"/>
   </w:num>
   <w:num w:numId="24" w16cid:durableId="831287959">
-    <w:abstractNumId w:val="29"/>
+    <w:abstractNumId w:val="30"/>
   </w:num>
   <w:num w:numId="25" w16cid:durableId="955211925">
     <w:abstractNumId w:val="1"/>
@@ -15810,16 +17964,19 @@
     <w:abstractNumId w:val="0"/>
   </w:num>
   <w:num w:numId="27" w16cid:durableId="204025699">
-    <w:abstractNumId w:val="26"/>
+    <w:abstractNumId w:val="27"/>
   </w:num>
   <w:num w:numId="28" w16cid:durableId="1668511054">
     <w:abstractNumId w:val="2"/>
   </w:num>
   <w:num w:numId="29" w16cid:durableId="1196500216">
-    <w:abstractNumId w:val="16"/>
+    <w:abstractNumId w:val="17"/>
   </w:num>
   <w:num w:numId="30" w16cid:durableId="1059548547">
-    <w:abstractNumId w:val="14"/>
+    <w:abstractNumId w:val="15"/>
+  </w:num>
+  <w:num w:numId="31" w16cid:durableId="921376708">
+    <w:abstractNumId w:val="7"/>
   </w:num>
 </w:numbering>
 </file>
@@ -16346,7 +18503,6 @@
   <w:style w:type="character" w:default="1" w:styleId="Fuentedeprrafopredeter">
     <w:name w:val="Default Paragraph Font"/>
     <w:uiPriority w:val="1"/>
-    <w:semiHidden/>
     <w:unhideWhenUsed/>
   </w:style>
   <w:style w:type="table" w:default="1" w:styleId="Tablanormal">

</xml_diff>